<commit_message>
Highlight the TNMS client login in the customer install guide.
</commit_message>
<xml_diff>
--- a/docs/customer/TNMS-9.1-RHEL8-install-log.docx
+++ b/docs/customer/TNMS-9.1-RHEL8-install-log.docx
@@ -33,7 +33,7 @@
         <w:pStyle w:val="BodyText"/>
       </w:pPr>
       <w:r>
-        <w:t xml:space="preserve">The passwords used on this host are in the table below. Write those same values into</w:t>
+        <w:t xml:space="preserve">The TNMS client login is the first section below. The database and SFTP passwords are in the table after that. Write the database passwords into</w:t>
       </w:r>
       <w:r>
         <w:t xml:space="preserve"> </w:t>
@@ -158,11 +158,270 @@
       <w:pPr>
         <w:pStyle w:val="Heading2"/>
       </w:pPr>
-      <w:bookmarkStart w:id="23" w:name="values-used-on-this-host"/>
+      <w:bookmarkStart w:id="23" w:name="tnms-client-login"/>
+      <w:r>
+        <w:t xml:space="preserve">TNMS client login</w:t>
+      </w:r>
+      <w:bookmarkEnd w:id="23"/>
+    </w:p>
+    <w:p>
+      <w:pPr>
+        <w:pStyle w:val="FirstParagraph"/>
+      </w:pPr>
+      <w:r>
+        <w:t xml:space="preserve">Use this login in the browser and in the TNMS client.</w:t>
+      </w:r>
+    </w:p>
+    <w:tbl>
+      <w:tblPr>
+        <w:tblStyle w:val="Table"/>
+        <w:tblW w:type="dxa" w:w="10080"/>
+        <w:tblLayout w:type="fixed"/>
+        <w:tblLook w:firstRow="1" w:noHBand="0" w:noVBand="1"/>
+      </w:tblPr>
+      <w:tblGrid>
+        <w:gridCol w:w="3200"/>
+        <w:gridCol w:w="6880"/>
+      </w:tblGrid>
+      <w:tr>
+        <w:trPr>
+          <w:cnfStyle w:firstRow="1"/>
+        </w:trPr>
+        <w:tc>
+          <w:tcPr>
+            <w:shd w:val="clear" w:color="auto" w:fill="9A3412"/>
+            <w:tcW w:w="3200" w:type="dxa"/>
+            <w:tcBorders>
+              <w:bottom w:val="single"/>
+            </w:tcBorders>
+            <w:vAlign w:val="bottom"/>
+          </w:tcPr>
+          <w:p>
+            <w:pPr>
+              <w:pStyle w:val="Compact"/>
+              <w:jc w:val="left"/>
+            </w:pPr>
+            <w:r>
+              <w:t xml:space="preserve">Client login</w:t>
+            </w:r>
+          </w:p>
+        </w:tc>
+        <w:tc>
+          <w:tcPr>
+            <w:shd w:val="clear" w:color="auto" w:fill="9A3412"/>
+            <w:tcW w:w="6880" w:type="dxa"/>
+            <w:tcBorders>
+              <w:bottom w:val="single"/>
+            </w:tcBorders>
+            <w:vAlign w:val="bottom"/>
+          </w:tcPr>
+          <w:p>
+            <w:pPr>
+              <w:pStyle w:val="Compact"/>
+              <w:jc w:val="left"/>
+            </w:pPr>
+            <w:r>
+              <w:t xml:space="preserve">Value</w:t>
+            </w:r>
+          </w:p>
+        </w:tc>
+      </w:tr>
+      <w:tr>
+        <w:tc>
+          <w:tcPr>
+            <w:shd w:val="clear" w:color="auto" w:fill="FFF7ED"/>
+            <w:tcW w:w="3200" w:type="dxa"/>
+          </w:tcPr>
+          <w:p>
+            <w:pPr>
+              <w:pStyle w:val="Compact"/>
+              <w:jc w:val="left"/>
+            </w:pPr>
+            <w:r>
+              <w:t xml:space="preserve">Username</w:t>
+            </w:r>
+          </w:p>
+        </w:tc>
+        <w:tc>
+          <w:tcPr>
+            <w:shd w:val="clear" w:color="auto" w:fill="FFF7ED"/>
+            <w:tcW w:w="6880" w:type="dxa"/>
+          </w:tcPr>
+          <w:p>
+            <w:pPr>
+              <w:pStyle w:val="Compact"/>
+              <w:jc w:val="left"/>
+            </w:pPr>
+            <w:r>
+              <w:rPr>
+                <w:rStyle w:val="VerbatimChar"/>
+              </w:rPr>
+              <w:t xml:space="preserve">Administrator</w:t>
+            </w:r>
+          </w:p>
+        </w:tc>
+      </w:tr>
+      <w:tr>
+        <w:tc>
+          <w:tcPr>
+            <w:shd w:val="clear" w:color="auto" w:fill="F6C453"/>
+            <w:tcW w:w="3200" w:type="dxa"/>
+          </w:tcPr>
+          <w:p>
+            <w:pPr>
+              <w:pStyle w:val="Compact"/>
+              <w:jc w:val="left"/>
+            </w:pPr>
+            <w:r>
+              <w:t xml:space="preserve">Password</w:t>
+            </w:r>
+          </w:p>
+        </w:tc>
+        <w:tc>
+          <w:tcPr>
+            <w:shd w:val="clear" w:color="auto" w:fill="F6C453"/>
+            <w:tcW w:w="6880" w:type="dxa"/>
+          </w:tcPr>
+          <w:p>
+            <w:pPr>
+              <w:pStyle w:val="Compact"/>
+              <w:jc w:val="left"/>
+            </w:pPr>
+            <w:r>
+              <w:rPr>
+                <w:rStyle w:val="VerbatimChar"/>
+              </w:rPr>
+              <w:t xml:space="preserve">e2e!Net4u#</w:t>
+            </w:r>
+          </w:p>
+        </w:tc>
+      </w:tr>
+      <w:tr>
+        <w:tc>
+          <w:tcPr>
+            <w:shd w:val="clear" w:color="auto" w:fill="FFF7ED"/>
+            <w:tcW w:w="3200" w:type="dxa"/>
+          </w:tcPr>
+          <w:p>
+            <w:pPr>
+              <w:pStyle w:val="Compact"/>
+              <w:jc w:val="left"/>
+            </w:pPr>
+            <w:r>
+              <w:t xml:space="preserve">Address</w:t>
+            </w:r>
+          </w:p>
+        </w:tc>
+        <w:tc>
+          <w:tcPr>
+            <w:shd w:val="clear" w:color="auto" w:fill="FFF7ED"/>
+            <w:tcW w:w="6880" w:type="dxa"/>
+          </w:tcPr>
+          <w:p>
+            <w:pPr>
+              <w:pStyle w:val="Compact"/>
+              <w:jc w:val="left"/>
+            </w:pPr>
+            <w:r>
+              <w:rPr>
+                <w:rStyle w:val="VerbatimChar"/>
+              </w:rPr>
+              <w:t xml:space="preserve">https://&lt;server-ip&gt;:8444/tnms-webclient</w:t>
+            </w:r>
+          </w:p>
+        </w:tc>
+      </w:tr>
+      <w:tr>
+        <w:tc>
+          <w:tcPr>
+            <w:shd w:val="clear" w:color="auto" w:fill="FFF7ED"/>
+            <w:tcW w:w="3200" w:type="dxa"/>
+          </w:tcPr>
+          <w:p>
+            <w:pPr>
+              <w:pStyle w:val="Compact"/>
+              <w:jc w:val="left"/>
+            </w:pPr>
+            <w:r>
+              <w:t xml:space="preserve">Port</w:t>
+            </w:r>
+          </w:p>
+        </w:tc>
+        <w:tc>
+          <w:tcPr>
+            <w:shd w:val="clear" w:color="auto" w:fill="FFF7ED"/>
+            <w:tcW w:w="6880" w:type="dxa"/>
+          </w:tcPr>
+          <w:p>
+            <w:pPr>
+              <w:pStyle w:val="Compact"/>
+              <w:jc w:val="left"/>
+            </w:pPr>
+            <w:r>
+              <w:t xml:space="preserve">TCP</w:t>
+            </w:r>
+            <w:r>
+              <w:t xml:space="preserve"> </w:t>
+            </w:r>
+            <w:r>
+              <w:rPr>
+                <w:rStyle w:val="VerbatimChar"/>
+              </w:rPr>
+              <w:t xml:space="preserve">8444</w:t>
+            </w:r>
+          </w:p>
+        </w:tc>
+      </w:tr>
+    </w:tbl>
+    <w:p>
+      <w:pPr>
+        <w:pStyle w:val="BlockText"/>
+      </w:pPr>
+      <w:r>
+        <w:t xml:space="preserve">The first login asks for a new password. Use at least 8 characters, with two letters and one number, and change at least 3 characters from</w:t>
+      </w:r>
+      <w:r>
+        <w:t xml:space="preserve"> </w:t>
+      </w:r>
+      <w:r>
+        <w:rPr>
+          <w:rStyle w:val="VerbatimChar"/>
+        </w:rPr>
+        <w:t xml:space="preserve">e2e!Net4u#</w:t>
+      </w:r>
+      <w:r>
+        <w:t xml:space="preserve">. Keep the username out of the new password, and keep any run of letters or digits to 3.</w:t>
+      </w:r>
+    </w:p>
+    <w:p>
+      <w:pPr>
+        <w:pStyle w:val="FirstParagraph"/>
+      </w:pPr>
+      <w:r>
+        <w:t xml:space="preserve">Allow inbound TCP 8444 on the security group in front of the server. The browser warns about the certificate. Continue past that warning. The next table is the database and SFTP passwords. Those values go in</w:t>
+      </w:r>
+      <w:r>
+        <w:t xml:space="preserve"> </w:t>
+      </w:r>
+      <w:r>
+        <w:rPr>
+          <w:rStyle w:val="VerbatimChar"/>
+        </w:rPr>
+        <w:t xml:space="preserve">/root/tnms-db-credentials</w:t>
+      </w:r>
+      <w:r>
+        <w:t xml:space="preserve">.</w:t>
+      </w:r>
+    </w:p>
+    <w:p>
+      <w:pPr>
+        <w:pStyle w:val="Heading2"/>
+      </w:pPr>
+      <w:bookmarkStart w:id="24" w:name="values-used-on-this-host"/>
       <w:r>
         <w:t xml:space="preserve">Values used on this host</w:t>
       </w:r>
-      <w:bookmarkEnd w:id="23"/>
+      <w:bookmarkEnd w:id="24"/>
     </w:p>
     <w:p>
       <w:pPr>
@@ -1131,11 +1390,11 @@
       <w:pPr>
         <w:pStyle w:val="Heading2"/>
       </w:pPr>
-      <w:bookmarkStart w:id="24" w:name="media-to-copy-onto-the-server"/>
+      <w:bookmarkStart w:id="25" w:name="media-to-copy-onto-the-server"/>
       <w:r>
         <w:t xml:space="preserve">Media to copy onto the server</w:t>
       </w:r>
-      <w:bookmarkEnd w:id="24"/>
+      <w:bookmarkEnd w:id="25"/>
     </w:p>
     <w:p>
       <w:pPr>
@@ -1454,11 +1713,11 @@
       <w:pPr>
         <w:pStyle w:val="Heading2"/>
       </w:pPr>
-      <w:bookmarkStart w:id="25" w:name="hostname-hosts-locale"/>
+      <w:bookmarkStart w:id="26" w:name="hostname-hosts-locale"/>
       <w:r>
         <w:t xml:space="preserve">1. Hostname, hosts, locale</w:t>
       </w:r>
-      <w:bookmarkEnd w:id="25"/>
+      <w:bookmarkEnd w:id="26"/>
     </w:p>
     <w:p>
       <w:pPr>
@@ -1871,11 +2130,11 @@
       <w:pPr>
         <w:pStyle w:val="Heading2"/>
       </w:pPr>
-      <w:bookmarkStart w:id="26" w:name="packages"/>
+      <w:bookmarkStart w:id="27" w:name="packages"/>
       <w:r>
         <w:t xml:space="preserve">2. Packages</w:t>
       </w:r>
-      <w:bookmarkEnd w:id="26"/>
+      <w:bookmarkEnd w:id="27"/>
     </w:p>
     <w:p>
       <w:pPr>
@@ -2156,11 +2415,11 @@
       <w:pPr>
         <w:pStyle w:val="Heading2"/>
       </w:pPr>
-      <w:bookmarkStart w:id="27" w:name="kernel-settings-and-the-firewall"/>
+      <w:bookmarkStart w:id="28" w:name="kernel-settings-and-the-firewall"/>
       <w:r>
         <w:t xml:space="preserve">3. Kernel settings and the firewall</w:t>
       </w:r>
-      <w:bookmarkEnd w:id="27"/>
+      <w:bookmarkEnd w:id="28"/>
     </w:p>
     <w:p>
       <w:pPr>
@@ -2560,11 +2819,11 @@
       <w:pPr>
         <w:pStyle w:val="Heading2"/>
       </w:pPr>
-      <w:bookmarkStart w:id="28" w:name="disk-space-the-installers-actually-check"/>
+      <w:bookmarkStart w:id="29" w:name="disk-space-the-installers-actually-check"/>
       <w:r>
         <w:t xml:space="preserve">4. Disk space the installers actually check</w:t>
       </w:r>
-      <w:bookmarkEnd w:id="28"/>
+      <w:bookmarkEnd w:id="29"/>
     </w:p>
     <w:p>
       <w:pPr>
@@ -4025,11 +4284,11 @@
       <w:pPr>
         <w:pStyle w:val="Heading2"/>
       </w:pPr>
-      <w:bookmarkStart w:id="29" w:name="unpack-the-media"/>
+      <w:bookmarkStart w:id="30" w:name="unpack-the-media"/>
       <w:r>
         <w:t xml:space="preserve">5. Unpack the media</w:t>
       </w:r>
-      <w:bookmarkEnd w:id="29"/>
+      <w:bookmarkEnd w:id="30"/>
     </w:p>
     <w:p>
       <w:pPr>
@@ -4875,11 +5134,11 @@
       <w:pPr>
         <w:pStyle w:val="Heading2"/>
       </w:pPr>
-      <w:bookmarkStart w:id="30" w:name="database-passwords"/>
+      <w:bookmarkStart w:id="31" w:name="database-passwords"/>
       <w:r>
         <w:t xml:space="preserve">6. Database passwords</w:t>
       </w:r>
-      <w:bookmarkEnd w:id="30"/>
+      <w:bookmarkEnd w:id="31"/>
     </w:p>
     <w:p>
       <w:pPr>
@@ -5199,11 +5458,11 @@
       <w:pPr>
         <w:pStyle w:val="Heading2"/>
       </w:pPr>
-      <w:bookmarkStart w:id="31" w:name="install-oracle-19c"/>
+      <w:bookmarkStart w:id="32" w:name="install-oracle-19c"/>
       <w:r>
         <w:t xml:space="preserve">7. Install Oracle 19c</w:t>
       </w:r>
-      <w:bookmarkEnd w:id="31"/>
+      <w:bookmarkEnd w:id="32"/>
     </w:p>
     <w:p>
       <w:pPr>
@@ -6266,11 +6525,11 @@
       <w:pPr>
         <w:pStyle w:val="Heading2"/>
       </w:pPr>
-      <w:bookmarkStart w:id="32" w:name="memory-check-before-the-tnms-wizard"/>
+      <w:bookmarkStart w:id="33" w:name="memory-check-before-the-tnms-wizard"/>
       <w:r>
         <w:t xml:space="preserve">8. Memory check before the TNMS wizard</w:t>
       </w:r>
-      <w:bookmarkEnd w:id="32"/>
+      <w:bookmarkEnd w:id="33"/>
     </w:p>
     <w:p>
       <w:pPr>
@@ -6344,11 +6603,11 @@
       <w:pPr>
         <w:pStyle w:val="Heading2"/>
       </w:pPr>
-      <w:bookmarkStart w:id="33" w:name="install-tnms-server-and-mediation"/>
+      <w:bookmarkStart w:id="34" w:name="install-tnms-server-and-mediation"/>
       <w:r>
         <w:t xml:space="preserve">9. Install TNMS Server and Mediation</w:t>
       </w:r>
-      <w:bookmarkEnd w:id="33"/>
+      <w:bookmarkEnd w:id="34"/>
     </w:p>
     <w:p>
       <w:pPr>
@@ -8228,11 +8487,11 @@
       <w:pPr>
         <w:pStyle w:val="Heading2"/>
       </w:pPr>
-      <w:bookmarkStart w:id="34" w:name="put-lsmem-back"/>
+      <w:bookmarkStart w:id="35" w:name="put-lsmem-back"/>
       <w:r>
         <w:t xml:space="preserve">10. Put lsmem back</w:t>
       </w:r>
-      <w:bookmarkEnd w:id="34"/>
+      <w:bookmarkEnd w:id="35"/>
     </w:p>
     <w:p>
       <w:pPr>
@@ -8404,11 +8663,11 @@
       <w:pPr>
         <w:pStyle w:val="Heading2"/>
       </w:pPr>
-      <w:bookmarkStart w:id="35" w:name="sftp-account"/>
+      <w:bookmarkStart w:id="36" w:name="sftp-account"/>
       <w:r>
         <w:t xml:space="preserve">11. SFTP account</w:t>
       </w:r>
-      <w:bookmarkEnd w:id="35"/>
+      <w:bookmarkEnd w:id="36"/>
     </w:p>
     <w:p>
       <w:pPr>
@@ -9633,11 +9892,11 @@
       <w:pPr>
         <w:pStyle w:val="Heading2"/>
       </w:pPr>
-      <w:bookmarkStart w:id="36" w:name="sudo-for-the-tnms-user"/>
+      <w:bookmarkStart w:id="37" w:name="sudo-for-the-tnms-user"/>
       <w:r>
         <w:t xml:space="preserve">12. sudo for the tnms user</w:t>
       </w:r>
-      <w:bookmarkEnd w:id="36"/>
+      <w:bookmarkEnd w:id="37"/>
     </w:p>
     <w:p>
       <w:pPr>
@@ -9888,11 +10147,11 @@
       <w:pPr>
         <w:pStyle w:val="Heading2"/>
       </w:pPr>
-      <w:bookmarkStart w:id="37" w:name="start-the-service"/>
+      <w:bookmarkStart w:id="38" w:name="start-the-service"/>
       <w:r>
         <w:t xml:space="preserve">13. Start the service</w:t>
       </w:r>
-      <w:bookmarkEnd w:id="37"/>
+      <w:bookmarkEnd w:id="38"/>
     </w:p>
     <w:p>
       <w:pPr>
@@ -10516,6 +10775,65 @@
         <w:pStyle w:val="FirstParagraph"/>
       </w:pPr>
       <w:r>
+        <w:t xml:space="preserve">When that 301 is present, the client can log in. Use the</w:t>
+      </w:r>
+      <w:r>
+        <w:t xml:space="preserve"> </w:t>
+      </w:r>
+      <w:r>
+        <w:rPr>
+          <w:b/>
+        </w:rPr>
+        <w:t xml:space="preserve">TNMS client login</w:t>
+      </w:r>
+      <w:r>
+        <w:t xml:space="preserve"> </w:t>
+      </w:r>
+      <w:r>
+        <w:t xml:space="preserve">at the start of this document: username</w:t>
+      </w:r>
+      <w:r>
+        <w:t xml:space="preserve"> </w:t>
+      </w:r>
+      <w:r>
+        <w:rPr>
+          <w:rStyle w:val="VerbatimChar"/>
+        </w:rPr>
+        <w:t xml:space="preserve">Administrator</w:t>
+      </w:r>
+      <w:r>
+        <w:t xml:space="preserve">, password</w:t>
+      </w:r>
+      <w:r>
+        <w:t xml:space="preserve"> </w:t>
+      </w:r>
+      <w:r>
+        <w:rPr>
+          <w:rStyle w:val="VerbatimChar"/>
+        </w:rPr>
+        <w:t xml:space="preserve">e2e!Net4u#</w:t>
+      </w:r>
+      <w:r>
+        <w:t xml:space="preserve">, address</w:t>
+      </w:r>
+      <w:r>
+        <w:t xml:space="preserve"> </w:t>
+      </w:r>
+      <w:r>
+        <w:rPr>
+          <w:rStyle w:val="VerbatimChar"/>
+        </w:rPr>
+        <w:t xml:space="preserve">https://&lt;server-ip&gt;:8444/tnms-webclient</w:t>
+      </w:r>
+      <w:r>
+        <w:t xml:space="preserve">.</w:t>
+      </w:r>
+    </w:p>
+    <w:p>
+      <w:pPr>
+        <w:pStyle w:val="BodyText"/>
+      </w:pPr>
+      <w:r>
         <w:t xml:space="preserve">Startup logs can say</w:t>
       </w:r>
       <w:r>
@@ -10568,11 +10886,11 @@
       <w:pPr>
         <w:pStyle w:val="Heading2"/>
       </w:pPr>
-      <w:bookmarkStart w:id="38" w:name="checks"/>
+      <w:bookmarkStart w:id="39" w:name="checks"/>
       <w:r>
         <w:t xml:space="preserve">14. Checks</w:t>
       </w:r>
-      <w:bookmarkEnd w:id="38"/>
+      <w:bookmarkEnd w:id="39"/>
     </w:p>
     <w:p>
       <w:pPr>
@@ -11167,11 +11485,11 @@
       <w:pPr>
         <w:pStyle w:val="Heading2"/>
       </w:pPr>
-      <w:bookmarkStart w:id="39" w:name="what-happened-on-this-host"/>
+      <w:bookmarkStart w:id="40" w:name="what-happened-on-this-host"/>
       <w:r>
         <w:t xml:space="preserve">What happened on this host</w:t>
       </w:r>
-      <w:bookmarkEnd w:id="39"/>
+      <w:bookmarkEnd w:id="40"/>
     </w:p>
     <w:p>
       <w:pPr>
@@ -11242,11 +11560,11 @@
       <w:pPr>
         <w:pStyle w:val="Heading2"/>
       </w:pPr>
-      <w:bookmarkStart w:id="40" w:name="manual-step-9-two-ssh-sessions"/>
+      <w:bookmarkStart w:id="41" w:name="manual-step-9-two-ssh-sessions"/>
       <w:r>
         <w:t xml:space="preserve">Manual step 9: two SSH sessions</w:t>
       </w:r>
-      <w:bookmarkEnd w:id="40"/>
+      <w:bookmarkEnd w:id="41"/>
     </w:p>
     <w:p>
       <w:pPr>
@@ -14159,7 +14477,7 @@
     </w:lvl>
   </w:abstractNum>
   <w:abstractNum w:abstractNumId="990">
-    <w:nsid w:val="cbdb2f53"/>
+    <w:nsid w:val="77accc53"/>
     <w:multiLevelType w:val="multilevel"/>
     <w:lvl w:ilvl="0">
       <w:numFmt w:val="bullet"/>
@@ -14262,7 +14580,7 @@
     </w:lvl>
   </w:abstractNum>
   <w:abstractNum w:abstractNumId="991">
-    <w:nsid w:val="47390ad8"/>
+    <w:nsid w:val="e30aa7d7"/>
     <w:multiLevelType w:val="multilevel"/>
     <w:lvl w:ilvl="0">
       <w:numFmt w:val="bullet"/>
@@ -14365,7 +14683,7 @@
     </w:lvl>
   </w:abstractNum>
   <w:abstractNum w:abstractNumId="99411">
-    <w:nsid w:val="7c2bf611"/>
+    <w:nsid w:val="27fd9311"/>
     <w:multiLevelType w:val="multilevel"/>
     <w:lvl w:ilvl="0">
       <w:start w:val="1"/>
@@ -14477,7 +14795,7 @@
     </w:lvl>
   </w:abstractNum>
   <w:abstractNum w:abstractNumId="99412">
-    <w:nsid w:val="c3e7ed69"/>
+    <w:nsid w:val="6fb98a69"/>
     <w:multiLevelType w:val="multilevel"/>
     <w:lvl w:ilvl="0">
       <w:start w:val="2"/>
@@ -14589,7 +14907,7 @@
     </w:lvl>
   </w:abstractNum>
   <w:abstractNum w:abstractNumId="99413">
-    <w:nsid w:val="483526a7"/>
+    <w:nsid w:val="e406c3a7"/>
     <w:multiLevelType w:val="multilevel"/>
     <w:lvl w:ilvl="0">
       <w:start w:val="3"/>

</xml_diff>

<commit_message>
Give the customer install log more space between sections.
</commit_message>
<xml_diff>
--- a/docs/customer/TNMS-9.1-RHEL8-install-log.docx
+++ b/docs/customer/TNMS-9.1-RHEL8-install-log.docx
@@ -171,6 +171,11 @@
       <w:r>
         <w:t xml:space="preserve">Use this login in the browser and in the TNMS client.</w:t>
       </w:r>
+    </w:p>
+    <w:p>
+      <w:pPr>
+        <w:spacing w:before="80" w:after="80" w:line="160" w:lineRule="exact"/>
+      </w:pPr>
     </w:p>
     <w:tbl>
       <w:tblPr>
@@ -185,6 +190,7 @@
       </w:tblGrid>
       <w:tr>
         <w:trPr>
+          <w:tblHeader/>
           <w:cnfStyle w:firstRow="1"/>
         </w:trPr>
         <w:tc>
@@ -431,6 +437,11 @@
         <w:t xml:space="preserve">Substitute the site address and names. Keep the paths and the SID unless the site table says otherwise.</w:t>
       </w:r>
     </w:p>
+    <w:p>
+      <w:pPr>
+        <w:spacing w:before="80" w:after="80" w:line="160" w:lineRule="exact"/>
+      </w:pPr>
+    </w:p>
     <w:tbl>
       <w:tblPr>
         <w:tblStyle w:val="Table"/>
@@ -444,6 +455,7 @@
       </w:tblGrid>
       <w:tr>
         <w:trPr>
+          <w:tblHeader/>
           <w:cnfStyle w:firstRow="1"/>
         </w:trPr>
         <w:tc>
@@ -1416,6 +1428,11 @@
         <w:t xml:space="preserve">.</w:t>
       </w:r>
     </w:p>
+    <w:p>
+      <w:pPr>
+        <w:spacing w:before="80" w:after="80" w:line="160" w:lineRule="exact"/>
+      </w:pPr>
+    </w:p>
     <w:tbl>
       <w:tblPr>
         <w:tblStyle w:val="Table"/>
@@ -1429,6 +1446,7 @@
       </w:tblGrid>
       <w:tr>
         <w:trPr>
+          <w:tblHeader/>
           <w:cnfStyle w:firstRow="1"/>
         </w:trPr>
         <w:tc>
@@ -1722,6 +1740,7 @@
     <w:p>
       <w:pPr>
         <w:pStyle w:val="SourceCode"/>
+        <w:spacing w:before="120" w:after="120" w:line="276" w:lineRule="auto"/>
       </w:pPr>
       <w:r>
         <w:rPr>
@@ -1758,6 +1777,7 @@
     <w:p>
       <w:pPr>
         <w:pStyle w:val="SourceCode"/>
+        <w:spacing w:before="120" w:after="120" w:line="276" w:lineRule="auto"/>
       </w:pPr>
       <w:r>
         <w:rPr>
@@ -1794,6 +1814,7 @@
     <w:p>
       <w:pPr>
         <w:pStyle w:val="SourceCode"/>
+        <w:spacing w:before="120" w:after="120" w:line="276" w:lineRule="auto"/>
       </w:pPr>
       <w:r>
         <w:rPr>
@@ -1804,12 +1825,13 @@
     </w:p>
     <w:p>
       <w:pPr>
-        <w:spacing w:before="80" w:after="80" w:line="40" w:lineRule="exact"/>
-      </w:pPr>
-    </w:p>
-    <w:p>
-      <w:pPr>
-        <w:pStyle w:val="SourceCode"/>
+        <w:spacing w:before="200" w:after="160" w:line="60" w:lineRule="exact"/>
+      </w:pPr>
+    </w:p>
+    <w:p>
+      <w:pPr>
+        <w:pStyle w:val="SourceCode"/>
+        <w:spacing w:before="120" w:after="120" w:line="276" w:lineRule="auto"/>
       </w:pPr>
       <w:r>
         <w:rPr>
@@ -1846,6 +1868,7 @@
     <w:p>
       <w:pPr>
         <w:pStyle w:val="SourceCode"/>
+        <w:spacing w:before="120" w:after="120" w:line="276" w:lineRule="auto"/>
       </w:pPr>
       <w:r>
         <w:rPr>
@@ -1876,6 +1899,7 @@
     <w:p>
       <w:pPr>
         <w:pStyle w:val="SourceCode"/>
+        <w:spacing w:before="120" w:after="120" w:line="276" w:lineRule="auto"/>
       </w:pPr>
       <w:r>
         <w:rPr>
@@ -1904,6 +1928,7 @@
     <w:p>
       <w:pPr>
         <w:pStyle w:val="SourceCode"/>
+        <w:spacing w:before="120" w:after="120" w:line="276" w:lineRule="auto"/>
       </w:pPr>
       <w:r>
         <w:rPr>
@@ -1944,6 +1969,7 @@
     <w:p>
       <w:pPr>
         <w:pStyle w:val="SourceCode"/>
+        <w:spacing w:before="120" w:after="120" w:line="276" w:lineRule="auto"/>
       </w:pPr>
       <w:r>
         <w:rPr>
@@ -1972,6 +1998,7 @@
     <w:p>
       <w:pPr>
         <w:pStyle w:val="SourceCode"/>
+        <w:spacing w:before="120" w:after="120" w:line="276" w:lineRule="auto"/>
       </w:pPr>
       <w:r>
         <w:rPr>
@@ -1994,6 +2021,7 @@
     <w:p>
       <w:pPr>
         <w:pStyle w:val="SourceCode"/>
+        <w:spacing w:before="120" w:after="120" w:line="276" w:lineRule="auto"/>
       </w:pPr>
       <w:r>
         <w:rPr>
@@ -2022,6 +2050,7 @@
     <w:p>
       <w:pPr>
         <w:pStyle w:val="SourceCode"/>
+        <w:spacing w:before="120" w:after="120" w:line="276" w:lineRule="auto"/>
       </w:pPr>
       <w:r>
         <w:rPr>
@@ -2044,6 +2073,7 @@
     <w:p>
       <w:pPr>
         <w:pStyle w:val="SourceCode"/>
+        <w:spacing w:before="120" w:after="120" w:line="276" w:lineRule="auto"/>
       </w:pPr>
       <w:r>
         <w:rPr>
@@ -2074,6 +2104,7 @@
     <w:p>
       <w:pPr>
         <w:pStyle w:val="SourceCode"/>
+        <w:spacing w:before="120" w:after="120" w:line="276" w:lineRule="auto"/>
       </w:pPr>
       <w:r>
         <w:rPr>
@@ -2096,6 +2127,7 @@
     <w:p>
       <w:pPr>
         <w:pStyle w:val="SourceCode"/>
+        <w:spacing w:before="120" w:after="120" w:line="276" w:lineRule="auto"/>
       </w:pPr>
       <w:r>
         <w:rPr>
@@ -2118,6 +2150,7 @@
     <w:p>
       <w:pPr>
         <w:pStyle w:val="SourceCode"/>
+        <w:spacing w:before="120" w:after="120" w:line="276" w:lineRule="auto"/>
       </w:pPr>
       <w:r>
         <w:rPr>
@@ -2139,6 +2172,7 @@
     <w:p>
       <w:pPr>
         <w:pStyle w:val="SourceCode"/>
+        <w:spacing w:before="120" w:after="120" w:line="276" w:lineRule="auto"/>
       </w:pPr>
       <w:r>
         <w:rPr>
@@ -2175,6 +2209,7 @@
     <w:p>
       <w:pPr>
         <w:pStyle w:val="SourceCode"/>
+        <w:spacing w:before="120" w:after="120" w:line="276" w:lineRule="auto"/>
       </w:pPr>
       <w:r>
         <w:rPr>
@@ -2185,12 +2220,13 @@
     </w:p>
     <w:p>
       <w:pPr>
-        <w:spacing w:before="80" w:after="80" w:line="40" w:lineRule="exact"/>
-      </w:pPr>
-    </w:p>
-    <w:p>
-      <w:pPr>
-        <w:pStyle w:val="SourceCode"/>
+        <w:spacing w:before="200" w:after="160" w:line="60" w:lineRule="exact"/>
+      </w:pPr>
+    </w:p>
+    <w:p>
+      <w:pPr>
+        <w:pStyle w:val="SourceCode"/>
+        <w:spacing w:before="120" w:after="120" w:line="276" w:lineRule="auto"/>
       </w:pPr>
       <w:r>
         <w:rPr>
@@ -2245,6 +2281,7 @@
     <w:p>
       <w:pPr>
         <w:pStyle w:val="SourceCode"/>
+        <w:spacing w:before="120" w:after="120" w:line="276" w:lineRule="auto"/>
       </w:pPr>
       <w:r>
         <w:rPr>
@@ -2267,6 +2304,7 @@
     <w:p>
       <w:pPr>
         <w:pStyle w:val="SourceCode"/>
+        <w:spacing w:before="120" w:after="120" w:line="276" w:lineRule="auto"/>
       </w:pPr>
       <w:r>
         <w:rPr>
@@ -2444,6 +2482,7 @@
     <w:p>
       <w:pPr>
         <w:pStyle w:val="SourceCode"/>
+        <w:spacing w:before="120" w:after="120" w:line="276" w:lineRule="auto"/>
       </w:pPr>
       <w:r>
         <w:rPr>
@@ -2481,12 +2520,13 @@
     </w:p>
     <w:p>
       <w:pPr>
-        <w:spacing w:before="80" w:after="80" w:line="40" w:lineRule="exact"/>
-      </w:pPr>
-    </w:p>
-    <w:p>
-      <w:pPr>
-        <w:pStyle w:val="SourceCode"/>
+        <w:spacing w:before="200" w:after="160" w:line="60" w:lineRule="exact"/>
+      </w:pPr>
+    </w:p>
+    <w:p>
+      <w:pPr>
+        <w:pStyle w:val="SourceCode"/>
+        <w:spacing w:before="120" w:after="120" w:line="276" w:lineRule="auto"/>
       </w:pPr>
       <w:r>
         <w:rPr>
@@ -2523,6 +2563,7 @@
     <w:p>
       <w:pPr>
         <w:pStyle w:val="SourceCode"/>
+        <w:spacing w:before="120" w:after="120" w:line="276" w:lineRule="auto"/>
       </w:pPr>
       <w:r>
         <w:rPr>
@@ -2569,12 +2610,13 @@
     </w:p>
     <w:p>
       <w:pPr>
-        <w:spacing w:before="80" w:after="80" w:line="40" w:lineRule="exact"/>
-      </w:pPr>
-    </w:p>
-    <w:p>
-      <w:pPr>
-        <w:pStyle w:val="SourceCode"/>
+        <w:spacing w:before="200" w:after="160" w:line="60" w:lineRule="exact"/>
+      </w:pPr>
+    </w:p>
+    <w:p>
+      <w:pPr>
+        <w:pStyle w:val="SourceCode"/>
+        <w:spacing w:before="120" w:after="120" w:line="276" w:lineRule="auto"/>
       </w:pPr>
       <w:r>
         <w:rPr>
@@ -2600,6 +2642,7 @@
     <w:p>
       <w:pPr>
         <w:pStyle w:val="SourceCode"/>
+        <w:spacing w:before="120" w:after="120" w:line="276" w:lineRule="auto"/>
       </w:pPr>
       <w:r>
         <w:rPr>
@@ -2628,6 +2671,7 @@
     <w:p>
       <w:pPr>
         <w:pStyle w:val="SourceCode"/>
+        <w:spacing w:before="120" w:after="120" w:line="276" w:lineRule="auto"/>
       </w:pPr>
       <w:r>
         <w:rPr>
@@ -2650,6 +2694,7 @@
     <w:p>
       <w:pPr>
         <w:pStyle w:val="SourceCode"/>
+        <w:spacing w:before="120" w:after="120" w:line="276" w:lineRule="auto"/>
       </w:pPr>
       <w:r>
         <w:rPr>
@@ -2678,6 +2723,7 @@
     <w:p>
       <w:pPr>
         <w:pStyle w:val="SourceCode"/>
+        <w:spacing w:before="120" w:after="120" w:line="276" w:lineRule="auto"/>
       </w:pPr>
       <w:r>
         <w:rPr>
@@ -2700,6 +2746,7 @@
     <w:p>
       <w:pPr>
         <w:pStyle w:val="SourceCode"/>
+        <w:spacing w:before="120" w:after="120" w:line="276" w:lineRule="auto"/>
       </w:pPr>
       <w:r>
         <w:rPr>
@@ -2728,6 +2775,7 @@
     <w:p>
       <w:pPr>
         <w:pStyle w:val="SourceCode"/>
+        <w:spacing w:before="120" w:after="120" w:line="276" w:lineRule="auto"/>
       </w:pPr>
       <w:r>
         <w:rPr>
@@ -2750,6 +2798,7 @@
     <w:p>
       <w:pPr>
         <w:pStyle w:val="SourceCode"/>
+        <w:spacing w:before="120" w:after="120" w:line="276" w:lineRule="auto"/>
       </w:pPr>
       <w:r>
         <w:rPr>
@@ -2778,6 +2827,7 @@
     <w:p>
       <w:pPr>
         <w:pStyle w:val="SourceCode"/>
+        <w:spacing w:before="120" w:after="120" w:line="276" w:lineRule="auto"/>
       </w:pPr>
       <w:r>
         <w:rPr>
@@ -3071,6 +3121,7 @@
     <w:p>
       <w:pPr>
         <w:pStyle w:val="SourceCode"/>
+        <w:spacing w:before="120" w:after="120" w:line="276" w:lineRule="auto"/>
       </w:pPr>
       <w:r>
         <w:rPr>
@@ -3182,6 +3233,7 @@
     <w:p>
       <w:pPr>
         <w:pStyle w:val="SourceCode"/>
+        <w:spacing w:before="120" w:after="120" w:line="276" w:lineRule="auto"/>
       </w:pPr>
       <w:r>
         <w:rPr>
@@ -3213,6 +3265,7 @@
     <w:p>
       <w:pPr>
         <w:pStyle w:val="SourceCode"/>
+        <w:spacing w:before="120" w:after="120" w:line="276" w:lineRule="auto"/>
       </w:pPr>
       <w:r>
         <w:rPr>
@@ -3264,6 +3317,7 @@
     <w:p>
       <w:pPr>
         <w:pStyle w:val="SourceCode"/>
+        <w:spacing w:before="120" w:after="120" w:line="276" w:lineRule="auto"/>
       </w:pPr>
       <w:r>
         <w:rPr>
@@ -3286,6 +3340,7 @@
     <w:p>
       <w:pPr>
         <w:pStyle w:val="SourceCode"/>
+        <w:spacing w:before="120" w:after="120" w:line="276" w:lineRule="auto"/>
       </w:pPr>
       <w:r>
         <w:rPr>
@@ -3414,6 +3469,7 @@
     <w:p>
       <w:pPr>
         <w:pStyle w:val="SourceCode"/>
+        <w:spacing w:before="120" w:after="120" w:line="276" w:lineRule="auto"/>
       </w:pPr>
       <w:r>
         <w:rPr>
@@ -3450,6 +3506,7 @@
     <w:p>
       <w:pPr>
         <w:pStyle w:val="SourceCode"/>
+        <w:spacing w:before="120" w:after="120" w:line="276" w:lineRule="auto"/>
       </w:pPr>
       <w:r>
         <w:rPr>
@@ -3460,12 +3517,13 @@
     </w:p>
     <w:p>
       <w:pPr>
-        <w:spacing w:before="80" w:after="80" w:line="40" w:lineRule="exact"/>
-      </w:pPr>
-    </w:p>
-    <w:p>
-      <w:pPr>
-        <w:pStyle w:val="SourceCode"/>
+        <w:spacing w:before="200" w:after="160" w:line="60" w:lineRule="exact"/>
+      </w:pPr>
+    </w:p>
+    <w:p>
+      <w:pPr>
+        <w:pStyle w:val="SourceCode"/>
+        <w:spacing w:before="120" w:after="120" w:line="276" w:lineRule="auto"/>
       </w:pPr>
       <w:r>
         <w:rPr>
@@ -3517,6 +3575,7 @@
     <w:p>
       <w:pPr>
         <w:pStyle w:val="SourceCode"/>
+        <w:spacing w:before="120" w:after="120" w:line="276" w:lineRule="auto"/>
       </w:pPr>
       <w:r>
         <w:rPr>
@@ -3602,6 +3661,7 @@
     <w:p>
       <w:pPr>
         <w:pStyle w:val="SourceCode"/>
+        <w:spacing w:before="120" w:after="120" w:line="276" w:lineRule="auto"/>
       </w:pPr>
       <w:r>
         <w:rPr>
@@ -3627,6 +3687,7 @@
     <w:p>
       <w:pPr>
         <w:pStyle w:val="SourceCode"/>
+        <w:spacing w:before="120" w:after="120" w:line="276" w:lineRule="auto"/>
       </w:pPr>
       <w:r>
         <w:rPr>
@@ -3652,6 +3713,7 @@
     <w:p>
       <w:pPr>
         <w:pStyle w:val="SourceCode"/>
+        <w:spacing w:before="120" w:after="120" w:line="276" w:lineRule="auto"/>
       </w:pPr>
       <w:r>
         <w:rPr>
@@ -3688,6 +3750,7 @@
     <w:p>
       <w:pPr>
         <w:pStyle w:val="SourceCode"/>
+        <w:spacing w:before="120" w:after="120" w:line="276" w:lineRule="auto"/>
       </w:pPr>
       <w:r>
         <w:rPr>
@@ -3698,12 +3761,13 @@
     </w:p>
     <w:p>
       <w:pPr>
-        <w:spacing w:before="80" w:after="80" w:line="40" w:lineRule="exact"/>
-      </w:pPr>
-    </w:p>
-    <w:p>
-      <w:pPr>
-        <w:pStyle w:val="SourceCode"/>
+        <w:spacing w:before="200" w:after="160" w:line="60" w:lineRule="exact"/>
+      </w:pPr>
+    </w:p>
+    <w:p>
+      <w:pPr>
+        <w:pStyle w:val="SourceCode"/>
+        <w:spacing w:before="120" w:after="120" w:line="276" w:lineRule="auto"/>
       </w:pPr>
       <w:r>
         <w:rPr>
@@ -3749,6 +3813,7 @@
     <w:p>
       <w:pPr>
         <w:pStyle w:val="SourceCode"/>
+        <w:spacing w:before="120" w:after="120" w:line="276" w:lineRule="auto"/>
       </w:pPr>
       <w:r>
         <w:rPr>
@@ -3795,12 +3860,13 @@
     </w:p>
     <w:p>
       <w:pPr>
-        <w:spacing w:before="80" w:after="80" w:line="40" w:lineRule="exact"/>
-      </w:pPr>
-    </w:p>
-    <w:p>
-      <w:pPr>
-        <w:pStyle w:val="SourceCode"/>
+        <w:spacing w:before="200" w:after="160" w:line="60" w:lineRule="exact"/>
+      </w:pPr>
+    </w:p>
+    <w:p>
+      <w:pPr>
+        <w:pStyle w:val="SourceCode"/>
+        <w:spacing w:before="120" w:after="120" w:line="276" w:lineRule="auto"/>
       </w:pPr>
       <w:r>
         <w:rPr>
@@ -3826,6 +3892,7 @@
     <w:p>
       <w:pPr>
         <w:pStyle w:val="SourceCode"/>
+        <w:spacing w:before="120" w:after="120" w:line="276" w:lineRule="auto"/>
       </w:pPr>
       <w:r>
         <w:rPr>
@@ -3862,6 +3929,7 @@
     <w:p>
       <w:pPr>
         <w:pStyle w:val="SourceCode"/>
+        <w:spacing w:before="120" w:after="120" w:line="276" w:lineRule="auto"/>
       </w:pPr>
       <w:r>
         <w:rPr>
@@ -3890,6 +3958,7 @@
     <w:p>
       <w:pPr>
         <w:pStyle w:val="SourceCode"/>
+        <w:spacing w:before="120" w:after="120" w:line="276" w:lineRule="auto"/>
       </w:pPr>
       <w:r>
         <w:rPr>
@@ -3971,6 +4040,7 @@
     <w:p>
       <w:pPr>
         <w:pStyle w:val="SourceCode"/>
+        <w:spacing w:before="120" w:after="120" w:line="276" w:lineRule="auto"/>
       </w:pPr>
       <w:r>
         <w:rPr>
@@ -4037,6 +4107,7 @@
     <w:p>
       <w:pPr>
         <w:pStyle w:val="SourceCode"/>
+        <w:spacing w:before="120" w:after="120" w:line="276" w:lineRule="auto"/>
       </w:pPr>
       <w:r>
         <w:rPr>
@@ -4104,6 +4175,7 @@
     <w:p>
       <w:pPr>
         <w:pStyle w:val="SourceCode"/>
+        <w:spacing w:before="120" w:after="120" w:line="276" w:lineRule="auto"/>
       </w:pPr>
       <w:r>
         <w:rPr>
@@ -4310,6 +4382,7 @@
     <w:p>
       <w:pPr>
         <w:pStyle w:val="SourceCode"/>
+        <w:spacing w:before="120" w:after="120" w:line="276" w:lineRule="auto"/>
       </w:pPr>
       <w:r>
         <w:rPr>
@@ -4376,6 +4449,7 @@
     <w:p>
       <w:pPr>
         <w:pStyle w:val="SourceCode"/>
+        <w:spacing w:before="120" w:after="120" w:line="276" w:lineRule="auto"/>
       </w:pPr>
       <w:r>
         <w:rPr>
@@ -4430,6 +4504,7 @@
     <w:p>
       <w:pPr>
         <w:pStyle w:val="SourceCode"/>
+        <w:spacing w:before="120" w:after="120" w:line="276" w:lineRule="auto"/>
       </w:pPr>
       <w:r>
         <w:rPr>
@@ -4452,6 +4527,7 @@
     <w:p>
       <w:pPr>
         <w:pStyle w:val="SourceCode"/>
+        <w:spacing w:before="120" w:after="120" w:line="276" w:lineRule="auto"/>
       </w:pPr>
       <w:r>
         <w:rPr>
@@ -4506,6 +4582,7 @@
     <w:p>
       <w:pPr>
         <w:pStyle w:val="SourceCode"/>
+        <w:spacing w:before="120" w:after="120" w:line="276" w:lineRule="auto"/>
       </w:pPr>
       <w:r>
         <w:rPr>
@@ -4528,6 +4605,7 @@
     <w:p>
       <w:pPr>
         <w:pStyle w:val="SourceCode"/>
+        <w:spacing w:before="120" w:after="120" w:line="276" w:lineRule="auto"/>
       </w:pPr>
       <w:r>
         <w:rPr>
@@ -4582,6 +4660,7 @@
     <w:p>
       <w:pPr>
         <w:pStyle w:val="SourceCode"/>
+        <w:spacing w:before="120" w:after="120" w:line="276" w:lineRule="auto"/>
       </w:pPr>
       <w:r>
         <w:rPr>
@@ -4592,12 +4671,13 @@
     </w:p>
     <w:p>
       <w:pPr>
-        <w:spacing w:before="80" w:after="80" w:line="40" w:lineRule="exact"/>
-      </w:pPr>
-    </w:p>
-    <w:p>
-      <w:pPr>
-        <w:pStyle w:val="SourceCode"/>
+        <w:spacing w:before="200" w:after="160" w:line="60" w:lineRule="exact"/>
+      </w:pPr>
+    </w:p>
+    <w:p>
+      <w:pPr>
+        <w:pStyle w:val="SourceCode"/>
+        <w:spacing w:before="120" w:after="120" w:line="276" w:lineRule="auto"/>
       </w:pPr>
       <w:r>
         <w:rPr>
@@ -4764,6 +4844,7 @@
     <w:p>
       <w:pPr>
         <w:pStyle w:val="SourceCode"/>
+        <w:spacing w:before="120" w:after="120" w:line="276" w:lineRule="auto"/>
       </w:pPr>
       <w:r>
         <w:rPr>
@@ -4911,6 +4992,7 @@
     <w:p>
       <w:pPr>
         <w:pStyle w:val="SourceCode"/>
+        <w:spacing w:before="120" w:after="120" w:line="276" w:lineRule="auto"/>
       </w:pPr>
       <w:r>
         <w:rPr>
@@ -4939,6 +5021,7 @@
     <w:p>
       <w:pPr>
         <w:pStyle w:val="SourceCode"/>
+        <w:spacing w:before="120" w:after="120" w:line="276" w:lineRule="auto"/>
       </w:pPr>
       <w:r>
         <w:rPr>
@@ -4988,6 +5071,7 @@
     <w:p>
       <w:pPr>
         <w:pStyle w:val="SourceCode"/>
+        <w:spacing w:before="120" w:after="120" w:line="276" w:lineRule="auto"/>
       </w:pPr>
       <w:r>
         <w:rPr>
@@ -5062,6 +5146,7 @@
     <w:p>
       <w:pPr>
         <w:pStyle w:val="SourceCode"/>
+        <w:spacing w:before="120" w:after="120" w:line="276" w:lineRule="auto"/>
       </w:pPr>
       <w:r>
         <w:rPr>
@@ -5143,6 +5228,7 @@
     <w:p>
       <w:pPr>
         <w:pStyle w:val="SourceCode"/>
+        <w:spacing w:before="120" w:after="120" w:line="276" w:lineRule="auto"/>
       </w:pPr>
       <w:r>
         <w:rPr>
@@ -5185,6 +5271,7 @@
     <w:p>
       <w:pPr>
         <w:pStyle w:val="SourceCode"/>
+        <w:spacing w:before="120" w:after="120" w:line="276" w:lineRule="auto"/>
       </w:pPr>
       <w:r>
         <w:rPr>
@@ -5326,6 +5413,7 @@
     <w:p>
       <w:pPr>
         <w:pStyle w:val="SourceCode"/>
+        <w:spacing w:before="120" w:after="120" w:line="276" w:lineRule="auto"/>
       </w:pPr>
       <w:r>
         <w:rPr>
@@ -5366,6 +5454,7 @@
     <w:p>
       <w:pPr>
         <w:pStyle w:val="SourceCode"/>
+        <w:spacing w:before="120" w:after="120" w:line="276" w:lineRule="auto"/>
       </w:pPr>
       <w:r>
         <w:rPr>
@@ -5388,6 +5477,7 @@
     <w:p>
       <w:pPr>
         <w:pStyle w:val="SourceCode"/>
+        <w:spacing w:before="120" w:after="120" w:line="276" w:lineRule="auto"/>
       </w:pPr>
       <w:r>
         <w:rPr>
@@ -5428,6 +5518,7 @@
     <w:p>
       <w:pPr>
         <w:pStyle w:val="SourceCode"/>
+        <w:spacing w:before="120" w:after="120" w:line="276" w:lineRule="auto"/>
       </w:pPr>
       <w:r>
         <w:rPr>
@@ -5502,6 +5593,7 @@
     <w:p>
       <w:pPr>
         <w:pStyle w:val="SourceCode"/>
+        <w:spacing w:before="120" w:after="120" w:line="276" w:lineRule="auto"/>
       </w:pPr>
       <w:r>
         <w:rPr>
@@ -5811,6 +5903,7 @@
     <w:p>
       <w:pPr>
         <w:pStyle w:val="SourceCode"/>
+        <w:spacing w:before="120" w:after="120" w:line="276" w:lineRule="auto"/>
       </w:pPr>
       <w:r>
         <w:rPr>
@@ -5952,6 +6045,7 @@
     <w:p>
       <w:pPr>
         <w:pStyle w:val="SourceCode"/>
+        <w:spacing w:before="120" w:after="120" w:line="276" w:lineRule="auto"/>
       </w:pPr>
       <w:r>
         <w:rPr>
@@ -5986,6 +6080,7 @@
     <w:p>
       <w:pPr>
         <w:pStyle w:val="SourceCode"/>
+        <w:spacing w:before="120" w:after="120" w:line="276" w:lineRule="auto"/>
       </w:pPr>
       <w:r>
         <w:rPr>
@@ -6016,6 +6111,7 @@
     <w:p>
       <w:pPr>
         <w:pStyle w:val="SourceCode"/>
+        <w:spacing w:before="120" w:after="120" w:line="276" w:lineRule="auto"/>
       </w:pPr>
       <w:r>
         <w:rPr>
@@ -6056,6 +6152,7 @@
     <w:p>
       <w:pPr>
         <w:pStyle w:val="SourceCode"/>
+        <w:spacing w:before="120" w:after="120" w:line="276" w:lineRule="auto"/>
       </w:pPr>
       <w:r>
         <w:rPr>
@@ -6086,6 +6183,7 @@
     <w:p>
       <w:pPr>
         <w:pStyle w:val="SourceCode"/>
+        <w:spacing w:before="120" w:after="120" w:line="276" w:lineRule="auto"/>
       </w:pPr>
       <w:r>
         <w:rPr>
@@ -6145,6 +6243,7 @@
     <w:p>
       <w:pPr>
         <w:pStyle w:val="SourceCode"/>
+        <w:spacing w:before="120" w:after="120" w:line="276" w:lineRule="auto"/>
       </w:pPr>
       <w:r>
         <w:rPr>
@@ -6173,6 +6272,7 @@
     <w:p>
       <w:pPr>
         <w:pStyle w:val="SourceCode"/>
+        <w:spacing w:before="120" w:after="120" w:line="276" w:lineRule="auto"/>
       </w:pPr>
       <w:r>
         <w:rPr>
@@ -6195,6 +6295,7 @@
     <w:p>
       <w:pPr>
         <w:pStyle w:val="SourceCode"/>
+        <w:spacing w:before="120" w:after="120" w:line="276" w:lineRule="auto"/>
       </w:pPr>
       <w:r>
         <w:rPr>
@@ -6247,6 +6348,7 @@
     <w:p>
       <w:pPr>
         <w:pStyle w:val="SourceCode"/>
+        <w:spacing w:before="120" w:after="120" w:line="276" w:lineRule="auto"/>
       </w:pPr>
       <w:r>
         <w:rPr>
@@ -6269,6 +6371,7 @@
     <w:p>
       <w:pPr>
         <w:pStyle w:val="SourceCode"/>
+        <w:spacing w:before="120" w:after="120" w:line="276" w:lineRule="auto"/>
       </w:pPr>
       <w:r>
         <w:rPr>
@@ -6309,6 +6412,7 @@
     <w:p>
       <w:pPr>
         <w:pStyle w:val="SourceCode"/>
+        <w:spacing w:before="120" w:after="120" w:line="276" w:lineRule="auto"/>
       </w:pPr>
       <w:r>
         <w:rPr>
@@ -6809,6 +6913,7 @@
     <w:p>
       <w:pPr>
         <w:pStyle w:val="SourceCode"/>
+        <w:spacing w:before="120" w:after="120" w:line="276" w:lineRule="auto"/>
       </w:pPr>
       <w:r>
         <w:rPr>
@@ -6847,6 +6952,7 @@
     <w:p>
       <w:pPr>
         <w:pStyle w:val="SourceCode"/>
+        <w:spacing w:before="120" w:after="120" w:line="276" w:lineRule="auto"/>
       </w:pPr>
       <w:r>
         <w:rPr>
@@ -6866,6 +6972,7 @@
     <w:p>
       <w:pPr>
         <w:pStyle w:val="SourceCode"/>
+        <w:spacing w:before="120" w:after="120" w:line="276" w:lineRule="auto"/>
       </w:pPr>
       <w:r>
         <w:rPr>
@@ -6940,6 +7047,11 @@
       <w:r>
         <w:t xml:space="preserve">The script selects the same choices this host used:</w:t>
       </w:r>
+    </w:p>
+    <w:p>
+      <w:pPr>
+        <w:spacing w:before="80" w:after="80" w:line="160" w:lineRule="exact"/>
+      </w:pPr>
     </w:p>
     <w:tbl>
       <w:tblPr>
@@ -6954,6 +7066,7 @@
       </w:tblGrid>
       <w:tr>
         <w:trPr>
+          <w:tblHeader/>
           <w:cnfStyle w:firstRow="1"/>
         </w:trPr>
         <w:tc>
@@ -7456,6 +7569,11 @@
         </w:tc>
       </w:tr>
     </w:tbl>
+    <w:p>
+      <w:pPr>
+        <w:spacing w:before="80" w:after="80" w:line="160" w:lineRule="exact"/>
+      </w:pPr>
+    </w:p>
     <w:tbl>
       <w:tblPr>
         <w:tblStyle w:val="Table"/>
@@ -7469,6 +7587,7 @@
       </w:tblGrid>
       <w:tr>
         <w:trPr>
+          <w:tblHeader/>
           <w:cnfStyle w:firstRow="1"/>
         </w:trPr>
         <w:tc>
@@ -7942,6 +8061,7 @@
     <w:p>
       <w:pPr>
         <w:pStyle w:val="SourceCode"/>
+        <w:spacing w:before="120" w:after="120" w:line="276" w:lineRule="auto"/>
       </w:pPr>
       <w:r>
         <w:rPr>
@@ -8032,6 +8152,7 @@
     <w:p>
       <w:pPr>
         <w:pStyle w:val="SourceCode"/>
+        <w:spacing w:before="120" w:after="120" w:line="276" w:lineRule="auto"/>
       </w:pPr>
       <w:r>
         <w:rPr>
@@ -8060,6 +8181,7 @@
     <w:p>
       <w:pPr>
         <w:pStyle w:val="SourceCode"/>
+        <w:spacing w:before="120" w:after="120" w:line="276" w:lineRule="auto"/>
       </w:pPr>
       <w:r>
         <w:rPr>
@@ -8121,6 +8243,7 @@
     <w:p>
       <w:pPr>
         <w:pStyle w:val="SourceCode"/>
+        <w:spacing w:before="120" w:after="120" w:line="276" w:lineRule="auto"/>
       </w:pPr>
       <w:r>
         <w:rPr>
@@ -8169,6 +8292,7 @@
     <w:p>
       <w:pPr>
         <w:pStyle w:val="SourceCode"/>
+        <w:spacing w:before="120" w:after="120" w:line="276" w:lineRule="auto"/>
       </w:pPr>
       <w:r>
         <w:rPr>
@@ -8203,6 +8327,7 @@
     <w:p>
       <w:pPr>
         <w:pStyle w:val="SourceCode"/>
+        <w:spacing w:before="120" w:after="120" w:line="276" w:lineRule="auto"/>
       </w:pPr>
       <w:r>
         <w:rPr>
@@ -8225,6 +8350,7 @@
     <w:p>
       <w:pPr>
         <w:pStyle w:val="SourceCode"/>
+        <w:spacing w:before="120" w:after="120" w:line="276" w:lineRule="auto"/>
       </w:pPr>
       <w:r>
         <w:rPr>
@@ -8253,6 +8379,7 @@
     <w:p>
       <w:pPr>
         <w:pStyle w:val="SourceCode"/>
+        <w:spacing w:before="120" w:after="120" w:line="276" w:lineRule="auto"/>
       </w:pPr>
       <w:r>
         <w:rPr>
@@ -8349,6 +8476,7 @@
     <w:p>
       <w:pPr>
         <w:pStyle w:val="SourceCode"/>
+        <w:spacing w:before="120" w:after="120" w:line="276" w:lineRule="auto"/>
       </w:pPr>
       <w:r>
         <w:rPr>
@@ -8377,6 +8505,7 @@
     <w:p>
       <w:pPr>
         <w:pStyle w:val="SourceCode"/>
+        <w:spacing w:before="120" w:after="120" w:line="276" w:lineRule="auto"/>
       </w:pPr>
       <w:r>
         <w:rPr>
@@ -8399,6 +8528,7 @@
     <w:p>
       <w:pPr>
         <w:pStyle w:val="SourceCode"/>
+        <w:spacing w:before="120" w:after="120" w:line="276" w:lineRule="auto"/>
       </w:pPr>
       <w:r>
         <w:rPr>
@@ -8475,6 +8605,7 @@
     <w:p>
       <w:pPr>
         <w:pStyle w:val="SourceCode"/>
+        <w:spacing w:before="120" w:after="120" w:line="276" w:lineRule="auto"/>
       </w:pPr>
       <w:r>
         <w:rPr>
@@ -8519,6 +8650,7 @@
     <w:p>
       <w:pPr>
         <w:pStyle w:val="SourceCode"/>
+        <w:spacing w:before="120" w:after="120" w:line="276" w:lineRule="auto"/>
       </w:pPr>
       <w:r>
         <w:rPr>
@@ -8555,6 +8687,7 @@
     <w:p>
       <w:pPr>
         <w:pStyle w:val="SourceCode"/>
+        <w:spacing w:before="120" w:after="120" w:line="276" w:lineRule="auto"/>
       </w:pPr>
       <w:r>
         <w:rPr>
@@ -8583,6 +8716,7 @@
     <w:p>
       <w:pPr>
         <w:pStyle w:val="SourceCode"/>
+        <w:spacing w:before="120" w:after="120" w:line="276" w:lineRule="auto"/>
       </w:pPr>
       <w:r>
         <w:rPr>
@@ -8623,6 +8757,7 @@
     <w:p>
       <w:pPr>
         <w:pStyle w:val="SourceCode"/>
+        <w:spacing w:before="120" w:after="120" w:line="276" w:lineRule="auto"/>
       </w:pPr>
       <w:r>
         <w:rPr>
@@ -8651,6 +8786,7 @@
     <w:p>
       <w:pPr>
         <w:pStyle w:val="SourceCode"/>
+        <w:spacing w:before="120" w:after="120" w:line="276" w:lineRule="auto"/>
       </w:pPr>
       <w:r>
         <w:rPr>
@@ -8740,6 +8876,7 @@
     <w:p>
       <w:pPr>
         <w:pStyle w:val="SourceCode"/>
+        <w:spacing w:before="120" w:after="120" w:line="276" w:lineRule="auto"/>
       </w:pPr>
       <w:r>
         <w:rPr>
@@ -8791,6 +8928,7 @@
     <w:p>
       <w:pPr>
         <w:pStyle w:val="SourceCode"/>
+        <w:spacing w:before="120" w:after="120" w:line="276" w:lineRule="auto"/>
       </w:pPr>
       <w:r>
         <w:rPr>
@@ -8822,6 +8960,7 @@
     <w:p>
       <w:pPr>
         <w:pStyle w:val="SourceCode"/>
+        <w:spacing w:before="120" w:after="120" w:line="276" w:lineRule="auto"/>
       </w:pPr>
       <w:r>
         <w:rPr>
@@ -8832,12 +8971,13 @@
     </w:p>
     <w:p>
       <w:pPr>
-        <w:spacing w:before="80" w:after="80" w:line="40" w:lineRule="exact"/>
-      </w:pPr>
-    </w:p>
-    <w:p>
-      <w:pPr>
-        <w:pStyle w:val="SourceCode"/>
+        <w:spacing w:before="200" w:after="160" w:line="60" w:lineRule="exact"/>
+      </w:pPr>
+    </w:p>
+    <w:p>
+      <w:pPr>
+        <w:pStyle w:val="SourceCode"/>
+        <w:spacing w:before="120" w:after="120" w:line="276" w:lineRule="auto"/>
       </w:pPr>
       <w:r>
         <w:rPr>
@@ -8904,6 +9044,7 @@
     <w:p>
       <w:pPr>
         <w:pStyle w:val="SourceCode"/>
+        <w:spacing w:before="120" w:after="120" w:line="276" w:lineRule="auto"/>
       </w:pPr>
       <w:r>
         <w:rPr>
@@ -8944,6 +9085,7 @@
     <w:p>
       <w:pPr>
         <w:pStyle w:val="SourceCode"/>
+        <w:spacing w:before="120" w:after="120" w:line="276" w:lineRule="auto"/>
       </w:pPr>
       <w:r>
         <w:rPr>
@@ -8993,6 +9135,7 @@
     <w:p>
       <w:pPr>
         <w:pStyle w:val="SourceCode"/>
+        <w:spacing w:before="120" w:after="120" w:line="276" w:lineRule="auto"/>
       </w:pPr>
       <w:r>
         <w:rPr>
@@ -9021,6 +9164,7 @@
     <w:p>
       <w:pPr>
         <w:pStyle w:val="SourceCode"/>
+        <w:spacing w:before="120" w:after="120" w:line="276" w:lineRule="auto"/>
       </w:pPr>
       <w:r>
         <w:rPr>
@@ -9043,6 +9187,7 @@
     <w:p>
       <w:pPr>
         <w:pStyle w:val="SourceCode"/>
+        <w:spacing w:before="120" w:after="120" w:line="276" w:lineRule="auto"/>
       </w:pPr>
       <w:r>
         <w:rPr>
@@ -9071,6 +9216,7 @@
     <w:p>
       <w:pPr>
         <w:pStyle w:val="SourceCode"/>
+        <w:spacing w:before="120" w:after="120" w:line="276" w:lineRule="auto"/>
       </w:pPr>
       <w:r>
         <w:rPr>
@@ -9093,6 +9239,7 @@
     <w:p>
       <w:pPr>
         <w:pStyle w:val="SourceCode"/>
+        <w:spacing w:before="120" w:after="120" w:line="276" w:lineRule="auto"/>
       </w:pPr>
       <w:r>
         <w:rPr>
@@ -9121,6 +9268,7 @@
     <w:p>
       <w:pPr>
         <w:pStyle w:val="SourceCode"/>
+        <w:spacing w:before="120" w:after="120" w:line="276" w:lineRule="auto"/>
       </w:pPr>
       <w:r>
         <w:rPr>
@@ -9143,6 +9291,7 @@
     <w:p>
       <w:pPr>
         <w:pStyle w:val="SourceCode"/>
+        <w:spacing w:before="120" w:after="120" w:line="276" w:lineRule="auto"/>
       </w:pPr>
       <w:r>
         <w:rPr>
@@ -9183,6 +9332,7 @@
     <w:p>
       <w:pPr>
         <w:pStyle w:val="SourceCode"/>
+        <w:spacing w:before="120" w:after="120" w:line="276" w:lineRule="auto"/>
       </w:pPr>
       <w:r>
         <w:rPr>
@@ -9214,6 +9364,7 @@
     <w:p>
       <w:pPr>
         <w:pStyle w:val="SourceCode"/>
+        <w:spacing w:before="120" w:after="120" w:line="276" w:lineRule="auto"/>
       </w:pPr>
       <w:r>
         <w:rPr>
@@ -9284,6 +9435,7 @@
     <w:p>
       <w:pPr>
         <w:pStyle w:val="SourceCode"/>
+        <w:spacing w:before="120" w:after="120" w:line="276" w:lineRule="auto"/>
       </w:pPr>
       <w:r>
         <w:rPr>
@@ -9339,12 +9491,13 @@
     </w:p>
     <w:p>
       <w:pPr>
-        <w:spacing w:before="80" w:after="80" w:line="40" w:lineRule="exact"/>
-      </w:pPr>
-    </w:p>
-    <w:p>
-      <w:pPr>
-        <w:pStyle w:val="SourceCode"/>
+        <w:spacing w:before="200" w:after="160" w:line="60" w:lineRule="exact"/>
+      </w:pPr>
+    </w:p>
+    <w:p>
+      <w:pPr>
+        <w:pStyle w:val="SourceCode"/>
+        <w:spacing w:before="120" w:after="120" w:line="276" w:lineRule="auto"/>
       </w:pPr>
       <w:r>
         <w:rPr>
@@ -9387,6 +9540,7 @@
     <w:p>
       <w:pPr>
         <w:pStyle w:val="SourceCode"/>
+        <w:spacing w:before="120" w:after="120" w:line="276" w:lineRule="auto"/>
       </w:pPr>
       <w:r>
         <w:rPr>
@@ -9421,6 +9575,7 @@
     <w:p>
       <w:pPr>
         <w:pStyle w:val="SourceCode"/>
+        <w:spacing w:before="120" w:after="120" w:line="276" w:lineRule="auto"/>
       </w:pPr>
       <w:r>
         <w:rPr>
@@ -9452,6 +9607,7 @@
     <w:p>
       <w:pPr>
         <w:pStyle w:val="SourceCode"/>
+        <w:spacing w:before="120" w:after="120" w:line="276" w:lineRule="auto"/>
       </w:pPr>
       <w:r>
         <w:rPr>
@@ -9488,6 +9644,7 @@
     <w:p>
       <w:pPr>
         <w:pStyle w:val="SourceCode"/>
+        <w:spacing w:before="120" w:after="120" w:line="276" w:lineRule="auto"/>
       </w:pPr>
       <w:r>
         <w:rPr>
@@ -9516,6 +9673,7 @@
     <w:p>
       <w:pPr>
         <w:pStyle w:val="SourceCode"/>
+        <w:spacing w:before="120" w:after="120" w:line="276" w:lineRule="auto"/>
       </w:pPr>
       <w:r>
         <w:rPr>
@@ -9538,6 +9696,7 @@
     <w:p>
       <w:pPr>
         <w:pStyle w:val="SourceCode"/>
+        <w:spacing w:before="120" w:after="120" w:line="276" w:lineRule="auto"/>
       </w:pPr>
       <w:r>
         <w:rPr>
@@ -9596,6 +9755,7 @@
     <w:p>
       <w:pPr>
         <w:pStyle w:val="SourceCode"/>
+        <w:spacing w:before="120" w:after="120" w:line="276" w:lineRule="auto"/>
       </w:pPr>
       <w:r>
         <w:rPr>
@@ -9636,6 +9796,7 @@
     <w:p>
       <w:pPr>
         <w:pStyle w:val="SourceCode"/>
+        <w:spacing w:before="120" w:after="120" w:line="276" w:lineRule="auto"/>
       </w:pPr>
       <w:r>
         <w:rPr>
@@ -9694,6 +9855,7 @@
     <w:p>
       <w:pPr>
         <w:pStyle w:val="SourceCode"/>
+        <w:spacing w:before="120" w:after="120" w:line="276" w:lineRule="auto"/>
       </w:pPr>
       <w:r>
         <w:rPr>
@@ -9901,6 +10063,7 @@
     <w:p>
       <w:pPr>
         <w:pStyle w:val="SourceCode"/>
+        <w:spacing w:before="120" w:after="120" w:line="276" w:lineRule="auto"/>
       </w:pPr>
       <w:r>
         <w:rPr>
@@ -9967,6 +10130,7 @@
     <w:p>
       <w:pPr>
         <w:pStyle w:val="SourceCode"/>
+        <w:spacing w:before="120" w:after="120" w:line="276" w:lineRule="auto"/>
       </w:pPr>
       <w:r>
         <w:rPr>
@@ -9995,6 +10159,7 @@
     <w:p>
       <w:pPr>
         <w:pStyle w:val="SourceCode"/>
+        <w:spacing w:before="120" w:after="120" w:line="276" w:lineRule="auto"/>
       </w:pPr>
       <w:r>
         <w:rPr>
@@ -10017,6 +10182,7 @@
     <w:p>
       <w:pPr>
         <w:pStyle w:val="SourceCode"/>
+        <w:spacing w:before="120" w:after="120" w:line="276" w:lineRule="auto"/>
       </w:pPr>
       <w:r>
         <w:rPr>
@@ -10057,6 +10223,7 @@
     <w:p>
       <w:pPr>
         <w:pStyle w:val="SourceCode"/>
+        <w:spacing w:before="120" w:after="120" w:line="276" w:lineRule="auto"/>
       </w:pPr>
       <w:r>
         <w:rPr>
@@ -10079,6 +10246,7 @@
     <w:p>
       <w:pPr>
         <w:pStyle w:val="SourceCode"/>
+        <w:spacing w:before="120" w:after="120" w:line="276" w:lineRule="auto"/>
       </w:pPr>
       <w:r>
         <w:rPr>
@@ -10115,6 +10283,7 @@
     <w:p>
       <w:pPr>
         <w:pStyle w:val="SourceCode"/>
+        <w:spacing w:before="120" w:after="120" w:line="276" w:lineRule="auto"/>
       </w:pPr>
       <w:r>
         <w:rPr>
@@ -10236,6 +10405,7 @@
     <w:p>
       <w:pPr>
         <w:pStyle w:val="SourceCode"/>
+        <w:spacing w:before="120" w:after="120" w:line="276" w:lineRule="auto"/>
       </w:pPr>
       <w:r>
         <w:rPr>
@@ -10272,6 +10442,7 @@
     <w:p>
       <w:pPr>
         <w:pStyle w:val="SourceCode"/>
+        <w:spacing w:before="120" w:after="120" w:line="276" w:lineRule="auto"/>
       </w:pPr>
       <w:r>
         <w:rPr>
@@ -10300,6 +10471,7 @@
     <w:p>
       <w:pPr>
         <w:pStyle w:val="SourceCode"/>
+        <w:spacing w:before="120" w:after="120" w:line="276" w:lineRule="auto"/>
       </w:pPr>
       <w:r>
         <w:rPr>
@@ -10310,12 +10482,13 @@
     </w:p>
     <w:p>
       <w:pPr>
-        <w:spacing w:before="80" w:after="80" w:line="40" w:lineRule="exact"/>
-      </w:pPr>
-    </w:p>
-    <w:p>
-      <w:pPr>
-        <w:pStyle w:val="SourceCode"/>
+        <w:spacing w:before="200" w:after="160" w:line="60" w:lineRule="exact"/>
+      </w:pPr>
+    </w:p>
+    <w:p>
+      <w:pPr>
+        <w:pStyle w:val="SourceCode"/>
+        <w:spacing w:before="120" w:after="120" w:line="276" w:lineRule="auto"/>
       </w:pPr>
       <w:r>
         <w:rPr>
@@ -10454,6 +10627,7 @@
     <w:p>
       <w:pPr>
         <w:pStyle w:val="SourceCode"/>
+        <w:spacing w:before="120" w:after="120" w:line="276" w:lineRule="auto"/>
       </w:pPr>
       <w:r>
         <w:rPr>
@@ -10488,6 +10662,7 @@
     <w:p>
       <w:pPr>
         <w:pStyle w:val="SourceCode"/>
+        <w:spacing w:before="120" w:after="120" w:line="276" w:lineRule="auto"/>
       </w:pPr>
       <w:r>
         <w:rPr>
@@ -10510,6 +10685,7 @@
     <w:p>
       <w:pPr>
         <w:pStyle w:val="SourceCode"/>
+        <w:spacing w:before="120" w:after="120" w:line="276" w:lineRule="auto"/>
       </w:pPr>
       <w:r>
         <w:rPr>
@@ -10538,6 +10714,7 @@
     <w:p>
       <w:pPr>
         <w:pStyle w:val="SourceCode"/>
+        <w:spacing w:before="120" w:after="120" w:line="276" w:lineRule="auto"/>
       </w:pPr>
       <w:r>
         <w:rPr>
@@ -10560,6 +10737,7 @@
     <w:p>
       <w:pPr>
         <w:pStyle w:val="SourceCode"/>
+        <w:spacing w:before="120" w:after="120" w:line="276" w:lineRule="auto"/>
       </w:pPr>
       <w:r>
         <w:rPr>
@@ -10612,6 +10790,7 @@
     <w:p>
       <w:pPr>
         <w:pStyle w:val="SourceCode"/>
+        <w:spacing w:before="120" w:after="120" w:line="276" w:lineRule="auto"/>
       </w:pPr>
       <w:r>
         <w:rPr>
@@ -10684,6 +10863,7 @@
     <w:p>
       <w:pPr>
         <w:pStyle w:val="SourceCode"/>
+        <w:spacing w:before="120" w:after="120" w:line="276" w:lineRule="auto"/>
       </w:pPr>
       <w:r>
         <w:rPr>
@@ -10744,6 +10924,7 @@
     <w:p>
       <w:pPr>
         <w:pStyle w:val="SourceCode"/>
+        <w:spacing w:before="120" w:after="120" w:line="276" w:lineRule="auto"/>
       </w:pPr>
       <w:r>
         <w:rPr>
@@ -10899,6 +11080,11 @@
       <w:r>
         <w:t xml:space="preserve">Each row is one command. Run the command in the Check column. The Expected output column is what that command should show. The same commands, with their full output, are in the steps above.</w:t>
       </w:r>
+    </w:p>
+    <w:p>
+      <w:pPr>
+        <w:spacing w:before="80" w:after="80" w:line="160" w:lineRule="exact"/>
+      </w:pPr>
     </w:p>
     <w:tbl>
       <w:tblPr>
@@ -10913,6 +11099,7 @@
       </w:tblGrid>
       <w:tr>
         <w:trPr>
+          <w:tblHeader/>
           <w:cnfStyle w:firstRow="1"/>
         </w:trPr>
         <w:tc>
@@ -11668,6 +11855,7 @@
     <w:p>
       <w:pPr>
         <w:pStyle w:val="SourceCode"/>
+        <w:spacing w:before="120" w:after="120" w:line="276" w:lineRule="auto"/>
       </w:pPr>
       <w:r>
         <w:rPr>
@@ -11860,6 +12048,7 @@
     <w:p>
       <w:pPr>
         <w:pStyle w:val="SourceCode"/>
+        <w:spacing w:before="120" w:after="120" w:line="276" w:lineRule="auto"/>
       </w:pPr>
       <w:r>
         <w:rPr>
@@ -11888,6 +12077,7 @@
     <w:p>
       <w:pPr>
         <w:pStyle w:val="SourceCode"/>
+        <w:spacing w:before="120" w:after="120" w:line="276" w:lineRule="auto"/>
       </w:pPr>
       <w:r>
         <w:rPr>
@@ -11925,6 +12115,7 @@
     <w:p>
       <w:pPr>
         <w:pStyle w:val="SourceCode"/>
+        <w:spacing w:before="120" w:after="120" w:line="276" w:lineRule="auto"/>
       </w:pPr>
       <w:r>
         <w:rPr>
@@ -11961,6 +12152,7 @@
     <w:p>
       <w:pPr>
         <w:pStyle w:val="SourceCode"/>
+        <w:spacing w:before="120" w:after="120" w:line="276" w:lineRule="auto"/>
       </w:pPr>
       <w:r>
         <w:rPr>
@@ -11971,12 +12163,13 @@
     </w:p>
     <w:p>
       <w:pPr>
-        <w:spacing w:before="80" w:after="80" w:line="40" w:lineRule="exact"/>
-      </w:pPr>
-    </w:p>
-    <w:p>
-      <w:pPr>
-        <w:pStyle w:val="SourceCode"/>
+        <w:spacing w:before="200" w:after="160" w:line="60" w:lineRule="exact"/>
+      </w:pPr>
+    </w:p>
+    <w:p>
+      <w:pPr>
+        <w:pStyle w:val="SourceCode"/>
+        <w:spacing w:before="120" w:after="120" w:line="276" w:lineRule="auto"/>
       </w:pPr>
       <w:r>
         <w:rPr>
@@ -12017,6 +12210,7 @@
     <w:p>
       <w:pPr>
         <w:pStyle w:val="SourceCode"/>
+        <w:spacing w:before="120" w:after="120" w:line="276" w:lineRule="auto"/>
       </w:pPr>
       <w:r>
         <w:rPr>
@@ -12087,6 +12281,7 @@
     <w:p>
       <w:pPr>
         <w:pStyle w:val="SourceCode"/>
+        <w:spacing w:before="120" w:after="120" w:line="276" w:lineRule="auto"/>
       </w:pPr>
       <w:r>
         <w:rPr>
@@ -12177,6 +12372,7 @@
     <w:p>
       <w:pPr>
         <w:pStyle w:val="SourceCode"/>
+        <w:spacing w:before="120" w:after="120" w:line="276" w:lineRule="auto"/>
       </w:pPr>
       <w:r>
         <w:rPr>
@@ -12246,6 +12442,7 @@
     <w:p>
       <w:pPr>
         <w:pStyle w:val="SourceCode"/>
+        <w:spacing w:before="120" w:after="120" w:line="276" w:lineRule="auto"/>
       </w:pPr>
       <w:r>
         <w:rPr>
@@ -12274,6 +12471,7 @@
     <w:p>
       <w:pPr>
         <w:pStyle w:val="SourceCode"/>
+        <w:spacing w:before="120" w:after="120" w:line="276" w:lineRule="auto"/>
       </w:pPr>
       <w:r>
         <w:rPr>
@@ -12509,6 +12707,7 @@
     <w:p>
       <w:pPr>
         <w:pStyle w:val="SourceCode"/>
+        <w:spacing w:before="120" w:after="120" w:line="276" w:lineRule="auto"/>
       </w:pPr>
       <w:r>
         <w:rPr>
@@ -12545,6 +12744,7 @@
     <w:p>
       <w:pPr>
         <w:pStyle w:val="SourceCode"/>
+        <w:spacing w:before="120" w:after="120" w:line="276" w:lineRule="auto"/>
       </w:pPr>
       <w:r>
         <w:rPr>
@@ -12623,6 +12823,7 @@
     <w:p>
       <w:pPr>
         <w:pStyle w:val="SourceCode"/>
+        <w:spacing w:before="120" w:after="120" w:line="276" w:lineRule="auto"/>
       </w:pPr>
       <w:r>
         <w:rPr>
@@ -12680,6 +12881,7 @@
     <w:p>
       <w:pPr>
         <w:pStyle w:val="SourceCode"/>
+        <w:spacing w:before="120" w:after="120" w:line="276" w:lineRule="auto"/>
       </w:pPr>
       <w:r>
         <w:rPr>
@@ -12767,6 +12969,7 @@
     <w:p>
       <w:pPr>
         <w:pStyle w:val="SourceCode"/>
+        <w:spacing w:before="120" w:after="120" w:line="276" w:lineRule="auto"/>
       </w:pPr>
       <w:r>
         <w:rPr>
@@ -13431,6 +13634,11 @@
       <w:r>
         <w:t xml:space="preserve">.</w:t>
       </w:r>
+    </w:p>
+    <w:p>
+      <w:pPr>
+        <w:spacing w:before="80" w:after="80" w:line="160" w:lineRule="exact"/>
+      </w:pPr>
     </w:p>
     <w:tbl>
       <w:tblPr>
@@ -13445,6 +13653,7 @@
       </w:tblGrid>
       <w:tr>
         <w:trPr>
+          <w:tblHeader/>
           <w:cnfStyle w:firstRow="1"/>
         </w:trPr>
         <w:tc>
@@ -14096,6 +14305,7 @@
     <w:p>
       <w:pPr>
         <w:pStyle w:val="SourceCode"/>
+        <w:spacing w:before="120" w:after="120" w:line="276" w:lineRule="auto"/>
       </w:pPr>
       <w:r>
         <w:rPr>
@@ -14186,6 +14396,7 @@
     <w:p>
       <w:pPr>
         <w:pStyle w:val="SourceCode"/>
+        <w:spacing w:before="120" w:after="120" w:line="276" w:lineRule="auto"/>
       </w:pPr>
       <w:r>
         <w:rPr>
@@ -14477,7 +14688,7 @@
     </w:lvl>
   </w:abstractNum>
   <w:abstractNum w:abstractNumId="990">
-    <w:nsid w:val="77accc53"/>
+    <w:nsid w:val="7a062075"/>
     <w:multiLevelType w:val="multilevel"/>
     <w:lvl w:ilvl="0">
       <w:numFmt w:val="bullet"/>
@@ -14580,7 +14791,7 @@
     </w:lvl>
   </w:abstractNum>
   <w:abstractNum w:abstractNumId="991">
-    <w:nsid w:val="e30aa7d7"/>
+    <w:nsid w:val="6563fc4f"/>
     <w:multiLevelType w:val="multilevel"/>
     <w:lvl w:ilvl="0">
       <w:numFmt w:val="bullet"/>
@@ -14683,7 +14894,7 @@
     </w:lvl>
   </w:abstractNum>
   <w:abstractNum w:abstractNumId="99411">
-    <w:nsid w:val="27fd9311"/>
+    <w:nsid w:val="2a56e733"/>
     <w:multiLevelType w:val="multilevel"/>
     <w:lvl w:ilvl="0">
       <w:start w:val="1"/>
@@ -14795,7 +15006,7 @@
     </w:lvl>
   </w:abstractNum>
   <w:abstractNum w:abstractNumId="99412">
-    <w:nsid w:val="6fb98a69"/>
+    <w:nsid w:val="7212de8b"/>
     <w:multiLevelType w:val="multilevel"/>
     <w:lvl w:ilvl="0">
       <w:start w:val="2"/>
@@ -14907,7 +15118,7 @@
     </w:lvl>
   </w:abstractNum>
   <w:abstractNum w:abstractNumId="99413">
-    <w:nsid w:val="e406c3a7"/>
+    <w:nsid w:val="6660181e"/>
     <w:multiLevelType w:val="multilevel"/>
     <w:lvl w:ilvl="0">
       <w:start w:val="3"/>
@@ -15183,7 +15394,7 @@
     <w:basedOn w:val="Normal"/>
     <w:link w:val="BodyTextChar"/>
     <w:pPr>
-      <w:spacing w:before="80" w:after="80"/>
+      <w:spacing w:before="40" w:after="200" w:line="276" w:lineRule="auto"/>
     </w:pPr>
     <w:rPr>
       <w:rFonts w:ascii="Arial" w:hAnsi="Arial" w:cs="Arial"/>
@@ -15203,7 +15414,7 @@
     <w:basedOn w:val="BodyText"/>
     <w:qFormat/>
     <w:pPr>
-      <w:spacing w:before="40" w:after="40"/>
+      <w:spacing w:before="40" w:after="80" w:line="260" w:lineRule="auto"/>
     </w:pPr>
   </w:style>
   <w:style w:type="paragraph" w:styleId="Title">
@@ -15294,7 +15505,7 @@
     <w:pPr>
       <w:keepNext/>
       <w:keepLines/>
-      <w:spacing w:before="0" w:after="200"/>
+      <w:spacing w:before="0" w:after="280" w:line="276" w:lineRule="auto"/>
       <w:outlineLvl w:val="0"/>
     </w:pPr>
     <w:rPr>
@@ -15315,10 +15526,10 @@
     <w:pPr>
       <w:keepNext/>
       <w:keepLines/>
-      <w:spacing w:before="360" w:after="120"/>
+      <w:spacing w:before="480" w:after="200" w:line="276" w:lineRule="auto"/>
       <w:outlineLvl w:val="1"/>
       <w:pBdr>
-        <w:bottom w:val="single" w:sz="8" w:space="1" w:color="1F4E79"/>
+        <w:bottom w:val="single" w:sz="12" w:space="8" w:color="1F4E79"/>
       </w:pBdr>
     </w:pPr>
     <w:rPr>
@@ -15480,8 +15691,8 @@
     <w:name w:val="Block Text"/>
     <w:basedOn w:val="BodyText"/>
     <w:pPr>
-      <w:spacing w:before="120" w:after="120"/>
-      <w:ind w:left="160" w:right="120"/>
+      <w:spacing w:before="200" w:after="240" w:line="276" w:lineRule="auto"/>
+      <w:ind w:left="220" w:right="180"/>
       <w:shd w:val="clear" w:color="auto" w:fill="FFF6E8"/>
       <w:pBdr>
         <w:left w:val="single" w:sz="18" w:space="8" w:color="C47B00"/>
@@ -15516,10 +15727,10 @@
         <w:insideV w:val="single" w:sz="4" w:space="0" w:color="D0D7DE"/>
       </w:tblBorders>
       <w:tblCellMar>
-        <w:top w:w="60" w:type="dxa"/>
-        <w:left w:w="100" w:type="dxa"/>
-        <w:bottom w:w="60" w:type="dxa"/>
-        <w:right w:w="100" w:type="dxa"/>
+        <w:top w:w="80" w:type="dxa"/>
+        <w:left w:w="140" w:type="dxa"/>
+        <w:bottom w:w="80" w:type="dxa"/>
+        <w:right w:w="140" w:type="dxa"/>
       </w:tblCellMar>
     </w:tblPr>
     <w:tblStylePr w:type="firstRow">
@@ -15639,8 +15850,8 @@
     <w:basedOn w:val="Normal"/>
     <w:link w:val="VerbatimChar"/>
     <w:pPr>
-      <w:spacing w:before="0" w:after="0" w:line="240" w:lineRule="auto"/>
-      <w:ind w:left="140" w:right="80"/>
+      <w:spacing w:before="40" w:after="40" w:line="276" w:lineRule="auto"/>
+      <w:ind w:left="200" w:right="140"/>
       <w:shd w:val="clear" w:color="auto" w:fill="F4F7F8"/>
       <w:pBdr>
         <w:left w:val="single" w:sz="12" w:space="6" w:color="1F4E79"/>

</xml_diff>

<commit_message>
Add a customer install guide that does not use this repository.
The new guide tells the customer to copy install-tnms-wizard.sh and tnms-install.properties.in into /root/tnms-wizard/ before step 9, and to put the vendor zips in /home/tnms-layout/resources.
</commit_message>
<xml_diff>
--- a/docs/customer/TNMS-9.1-RHEL8-install-log.docx
+++ b/docs/customer/TNMS-9.1-RHEL8-install-log.docx
@@ -6907,7 +6907,73 @@
         <w:t xml:space="preserve">/home/azureuser/TNMS</w:t>
       </w:r>
       <w:r>
-        <w:t xml:space="preserve">:</w:t>
+        <w:t xml:space="preserve">. A server that does not have this repository follows</w:t>
+      </w:r>
+      <w:r>
+        <w:t xml:space="preserve"> </w:t>
+      </w:r>
+      <w:r>
+        <w:rPr>
+          <w:rStyle w:val="VerbatimChar"/>
+        </w:rPr>
+        <w:t xml:space="preserve">docs/customer/install-without-repo.md</w:t>
+      </w:r>
+      <w:r>
+        <w:t xml:space="preserve">: copy</w:t>
+      </w:r>
+      <w:r>
+        <w:t xml:space="preserve"> </w:t>
+      </w:r>
+      <w:r>
+        <w:rPr>
+          <w:rStyle w:val="VerbatimChar"/>
+        </w:rPr>
+        <w:t xml:space="preserve">install-tnms-wizard.sh</w:t>
+      </w:r>
+      <w:r>
+        <w:t xml:space="preserve"> </w:t>
+      </w:r>
+      <w:r>
+        <w:t xml:space="preserve">and</w:t>
+      </w:r>
+      <w:r>
+        <w:t xml:space="preserve"> </w:t>
+      </w:r>
+      <w:r>
+        <w:rPr>
+          <w:rStyle w:val="VerbatimChar"/>
+        </w:rPr>
+        <w:t xml:space="preserve">tnms-install.properties.in</w:t>
+      </w:r>
+      <w:r>
+        <w:t xml:space="preserve"> </w:t>
+      </w:r>
+      <w:r>
+        <w:t xml:space="preserve">into</w:t>
+      </w:r>
+      <w:r>
+        <w:t xml:space="preserve"> </w:t>
+      </w:r>
+      <w:r>
+        <w:rPr>
+          <w:rStyle w:val="VerbatimChar"/>
+        </w:rPr>
+        <w:t xml:space="preserve">/root/tnms-wizard/</w:t>
+      </w:r>
+      <w:r>
+        <w:t xml:space="preserve">, then run</w:t>
+      </w:r>
+      <w:r>
+        <w:t xml:space="preserve"> </w:t>
+      </w:r>
+      <w:r>
+        <w:rPr>
+          <w:rStyle w:val="VerbatimChar"/>
+        </w:rPr>
+        <w:t xml:space="preserve">/root/tnms-wizard/install-tnms-wizard.sh</w:t>
+      </w:r>
+      <w:r>
+        <w:t xml:space="preserve">.</w:t>
       </w:r>
     </w:p>
     <w:p>
@@ -14688,7 +14754,7 @@
     </w:lvl>
   </w:abstractNum>
   <w:abstractNum w:abstractNumId="990">
-    <w:nsid w:val="7a062075"/>
+    <w:nsid w:val="6e8a96f4"/>
     <w:multiLevelType w:val="multilevel"/>
     <w:lvl w:ilvl="0">
       <w:numFmt w:val="bullet"/>
@@ -14791,7 +14857,7 @@
     </w:lvl>
   </w:abstractNum>
   <w:abstractNum w:abstractNumId="991">
-    <w:nsid w:val="6563fc4f"/>
+    <w:nsid w:val="59e872ce"/>
     <w:multiLevelType w:val="multilevel"/>
     <w:lvl w:ilvl="0">
       <w:numFmt w:val="bullet"/>
@@ -14894,7 +14960,7 @@
     </w:lvl>
   </w:abstractNum>
   <w:abstractNum w:abstractNumId="99411">
-    <w:nsid w:val="2a56e733"/>
+    <w:nsid w:val="2edb7a40"/>
     <w:multiLevelType w:val="multilevel"/>
     <w:lvl w:ilvl="0">
       <w:start w:val="1"/>
@@ -15006,7 +15072,7 @@
     </w:lvl>
   </w:abstractNum>
   <w:abstractNum w:abstractNumId="99412">
-    <w:nsid w:val="7212de8b"/>
+    <w:nsid w:val="e69771ee"/>
     <w:multiLevelType w:val="multilevel"/>
     <w:lvl w:ilvl="0">
       <w:start w:val="2"/>
@@ -15118,7 +15184,7 @@
     </w:lvl>
   </w:abstractNum>
   <w:abstractNum w:abstractNumId="99413">
-    <w:nsid w:val="6660181e"/>
+    <w:nsid w:val="dae4ab81"/>
     <w:multiLevelType w:val="multilevel"/>
     <w:lvl w:ilvl="0">
       <w:start w:val="3"/>

</xml_diff>

<commit_message>
Put the customer install files under /opt/tnms-install.
/opt itself is the 8 GB root filesystem, so the no-repo guide bind-mounts /opt/tnms-install from the large disk and copies the wizard files and the three zip files only after that mount.
</commit_message>
<xml_diff>
--- a/docs/customer/TNMS-9.1-RHEL8-install-log.docx
+++ b/docs/customer/TNMS-9.1-RHEL8-install-log.docx
@@ -6919,7 +6919,7 @@
         <w:t xml:space="preserve">docs/customer/install-without-repo.md</w:t>
       </w:r>
       <w:r>
-        <w:t xml:space="preserve">: copy</w:t>
+        <w:t xml:space="preserve">: after step 4, copy</w:t>
       </w:r>
       <w:r>
         <w:t xml:space="preserve"> </w:t>
@@ -6931,10 +6931,7 @@
         <w:t xml:space="preserve">install-tnms-wizard.sh</w:t>
       </w:r>
       <w:r>
-        <w:t xml:space="preserve"> </w:t>
-      </w:r>
-      <w:r>
-        <w:t xml:space="preserve">and</w:t>
+        <w:t xml:space="preserve">,</w:t>
       </w:r>
       <w:r>
         <w:t xml:space="preserve"> </w:t>
@@ -6946,19 +6943,16 @@
         <w:t xml:space="preserve">tnms-install.properties.in</w:t>
       </w:r>
       <w:r>
-        <w:t xml:space="preserve"> </w:t>
-      </w:r>
-      <w:r>
-        <w:t xml:space="preserve">into</w:t>
-      </w:r>
-      <w:r>
-        <w:t xml:space="preserve"> </w:t>
-      </w:r>
-      <w:r>
-        <w:rPr>
-          <w:rStyle w:val="VerbatimChar"/>
-        </w:rPr>
-        <w:t xml:space="preserve">/root/tnms-wizard/</w:t>
+        <w:t xml:space="preserve">, and the three zip files into</w:t>
+      </w:r>
+      <w:r>
+        <w:t xml:space="preserve"> </w:t>
+      </w:r>
+      <w:r>
+        <w:rPr>
+          <w:rStyle w:val="VerbatimChar"/>
+        </w:rPr>
+        <w:t xml:space="preserve">/opt/tnms-install</w:t>
       </w:r>
       <w:r>
         <w:t xml:space="preserve">, then run</w:t>
@@ -6970,7 +6964,7 @@
         <w:rPr>
           <w:rStyle w:val="VerbatimChar"/>
         </w:rPr>
-        <w:t xml:space="preserve">/root/tnms-wizard/install-tnms-wizard.sh</w:t>
+        <w:t xml:space="preserve">/opt/tnms-install/install-tnms-wizard.sh</w:t>
       </w:r>
       <w:r>
         <w:t xml:space="preserve">.</w:t>
@@ -14754,7 +14748,7 @@
     </w:lvl>
   </w:abstractNum>
   <w:abstractNum w:abstractNumId="990">
-    <w:nsid w:val="6e8a96f4"/>
+    <w:nsid w:val="c10285b9"/>
     <w:multiLevelType w:val="multilevel"/>
     <w:lvl w:ilvl="0">
       <w:numFmt w:val="bullet"/>
@@ -14857,7 +14851,7 @@
     </w:lvl>
   </w:abstractNum>
   <w:abstractNum w:abstractNumId="991">
-    <w:nsid w:val="59e872ce"/>
+    <w:nsid w:val="ac606193"/>
     <w:multiLevelType w:val="multilevel"/>
     <w:lvl w:ilvl="0">
       <w:numFmt w:val="bullet"/>
@@ -14960,7 +14954,7 @@
     </w:lvl>
   </w:abstractNum>
   <w:abstractNum w:abstractNumId="99411">
-    <w:nsid w:val="2edb7a40"/>
+    <w:nsid w:val="71534c77"/>
     <w:multiLevelType w:val="multilevel"/>
     <w:lvl w:ilvl="0">
       <w:start w:val="1"/>
@@ -15072,7 +15066,7 @@
     </w:lvl>
   </w:abstractNum>
   <w:abstractNum w:abstractNumId="99412">
-    <w:nsid w:val="e69771ee"/>
+    <w:nsid w:val="c90f605d"/>
     <w:multiLevelType w:val="multilevel"/>
     <w:lvl w:ilvl="0">
       <w:start w:val="2"/>
@@ -15184,7 +15178,7 @@
     </w:lvl>
   </w:abstractNum>
   <w:abstractNum w:abstractNumId="99413">
-    <w:nsid w:val="dae4ab81"/>
+    <w:nsid w:val="ad5c7d62"/>
     <w:multiLevelType w:val="multilevel"/>
     <w:lvl w:ilvl="0">
       <w:start w:val="3"/>

</xml_diff>

<commit_message>
Add a pre-install guide that mounts the 1 TB disk on /opt.
A new VM keeps Nokia's install paths. The data disk is its own volume on /opt, and the install guide unpacks the media there.
</commit_message>
<xml_diff>
--- a/docs/customer/TNMS-9.1-RHEL8-install-log.docx
+++ b/docs/customer/TNMS-9.1-RHEL8-install-log.docx
@@ -6907,7 +6907,19 @@
         <w:t xml:space="preserve">/home/azureuser/TNMS</w:t>
       </w:r>
       <w:r>
-        <w:t xml:space="preserve">. A server that does not have this repository follows</w:t>
+        <w:t xml:space="preserve">. A new VM follows</w:t>
+      </w:r>
+      <w:r>
+        <w:t xml:space="preserve"> </w:t>
+      </w:r>
+      <w:r>
+        <w:rPr>
+          <w:rStyle w:val="VerbatimChar"/>
+        </w:rPr>
+        <w:t xml:space="preserve">docs/customer/pre-install.md</w:t>
+      </w:r>
+      <w:r>
+        <w:t xml:space="preserve">, then</w:t>
       </w:r>
       <w:r>
         <w:t xml:space="preserve"> </w:t>
@@ -6919,7 +6931,19 @@
         <w:t xml:space="preserve">docs/customer/install-without-repo.md</w:t>
       </w:r>
       <w:r>
-        <w:t xml:space="preserve">: after step 4, copy</w:t>
+        <w:t xml:space="preserve">. That path mounts the 1 TB disk on</w:t>
+      </w:r>
+      <w:r>
+        <w:t xml:space="preserve"> </w:t>
+      </w:r>
+      <w:r>
+        <w:rPr>
+          <w:rStyle w:val="VerbatimChar"/>
+        </w:rPr>
+        <w:t xml:space="preserve">/opt</w:t>
+      </w:r>
+      <w:r>
+        <w:t xml:space="preserve">, copies</w:t>
       </w:r>
       <w:r>
         <w:t xml:space="preserve"> </w:t>
@@ -6955,7 +6979,7 @@
         <w:t xml:space="preserve">/opt/tnms-install</w:t>
       </w:r>
       <w:r>
-        <w:t xml:space="preserve">, then run</w:t>
+        <w:t xml:space="preserve">, and runs</w:t>
       </w:r>
       <w:r>
         <w:t xml:space="preserve"> </w:t>
@@ -14748,7 +14772,7 @@
     </w:lvl>
   </w:abstractNum>
   <w:abstractNum w:abstractNumId="990">
-    <w:nsid w:val="c10285b9"/>
+    <w:nsid w:val="45937827"/>
     <w:multiLevelType w:val="multilevel"/>
     <w:lvl w:ilvl="0">
       <w:numFmt w:val="bullet"/>
@@ -14851,7 +14875,7 @@
     </w:lvl>
   </w:abstractNum>
   <w:abstractNum w:abstractNumId="991">
-    <w:nsid w:val="ac606193"/>
+    <w:nsid w:val="40f15356"/>
     <w:multiLevelType w:val="multilevel"/>
     <w:lvl w:ilvl="0">
       <w:numFmt w:val="bullet"/>
@@ -14954,7 +14978,7 @@
     </w:lvl>
   </w:abstractNum>
   <w:abstractNum w:abstractNumId="99411">
-    <w:nsid w:val="71534c77"/>
+    <w:nsid w:val="f5e45b73"/>
     <w:multiLevelType w:val="multilevel"/>
     <w:lvl w:ilvl="0">
       <w:start w:val="1"/>
@@ -15066,7 +15090,7 @@
     </w:lvl>
   </w:abstractNum>
   <w:abstractNum w:abstractNumId="99412">
-    <w:nsid w:val="c90f605d"/>
+    <w:nsid w:val="4da052cb"/>
     <w:multiLevelType w:val="multilevel"/>
     <w:lvl w:ilvl="0">
       <w:start w:val="2"/>
@@ -15178,7 +15202,7 @@
     </w:lvl>
   </w:abstractNum>
   <w:abstractNum w:abstractNumId="99413">
-    <w:nsid w:val="ad5c7d62"/>
+    <w:nsid w:val="41ed8c5f"/>
     <w:multiLevelType w:val="multilevel"/>
     <w:lvl w:ilvl="0">
       <w:start w:val="3"/>

</xml_diff>